<commit_message>
Update user manual: rewrite 7.16 Software Updates, add 7.17 Mobile Companion
</commit_message>
<xml_diff>
--- a/docs/APRS_Command_User_Manual.docx
+++ b/docs/APRS_Command_User_Manual.docx
@@ -1952,6 +1952,25 @@
           <w:szCs w:val="21"/>
         </w:rPr>
         <w:t xml:space="preserve">7.16  Software Updates</w:t>
+      </w:r>
+    </w:p>
+    <w:p>
+      <w:pPr>
+        <w:spacing w:after="40" w:before="40"/>
+        <w:ind w:left="360"/>
+      </w:pPr>
+      <w:r>
+        <w:rPr>
+          <w:rFonts w:ascii="Calibri" w:cs="Calibri" w:eastAsia="Calibri" w:hAnsi="Calibri"/>
+          <w:b w:val="false"/>
+          <w:bCs w:val="false"/>
+          <w:i w:val="false"/>
+          <w:iCs w:val="false"/>
+          <w:color w:val="4A4A4A"/>
+          <w:sz w:val="21"/>
+          <w:szCs w:val="21"/>
+        </w:rPr>
+        <w:t xml:space="preserve">7.17  Mobile Companion Web View</w:t>
       </w:r>
     </w:p>
     <w:p>
@@ -30817,135 +30836,85 @@
           <w:sz w:val="22"/>
           <w:szCs w:val="22"/>
         </w:rPr>
-        <w:t xml:space="preserve">APRS Command does not currently include an automatic update check. To check for a newer version:</w:t>
-      </w:r>
-    </w:p>
-    <w:p>
-      <w:pPr>
-        <w:spacing w:after="60" w:before="60"/>
+        <w:t xml:space="preserve">APRS Command checks for updates automatically about 15 seconds after startup. The check is completely silent unless a newer version is found — if you are operating off-grid with no internet connection, nothing appears and nothing is affected.</w:t>
+      </w:r>
+    </w:p>
+    <w:p>
+      <w:pPr>
+        <w:keepNext w:val="false"/>
+        <w:spacing w:after="80" w:before="80" w:line="276" w:lineRule="auto"/>
+        <w:jc w:val="left"/>
+      </w:pPr>
+      <w:r>
+        <w:rPr>
+          <w:rFonts w:ascii="Calibri" w:cs="Calibri" w:eastAsia="Calibri" w:hAnsi="Calibri"/>
+          <w:b w:val="false"/>
+          <w:bCs w:val="false"/>
+          <w:i w:val="false"/>
+          <w:iCs w:val="false"/>
+          <w:color w:val="1A1A1A"/>
+          <w:sz w:val="22"/>
+          <w:szCs w:val="22"/>
+        </w:rPr>
+        <w:t xml:space="preserve">When an update is available, a notification appears in the corner of the main window:</w:t>
+      </w:r>
+    </w:p>
+    <w:p>
+      <w:pPr>
+        <w:spacing w:after="40" w:before="40"/>
         <w:ind w:left="720" w:hanging="360"/>
       </w:pPr>
       <w:r>
         <w:rPr>
           <w:rFonts w:ascii="Calibri" w:cs="Calibri" w:eastAsia="Calibri" w:hAnsi="Calibri"/>
-          <w:b/>
-          <w:bCs/>
-          <w:i w:val="false"/>
-          <w:iCs w:val="false"/>
-          <w:color w:val="1A56A0"/>
-          <w:sz w:val="22"/>
-          <w:szCs w:val="22"/>
-        </w:rPr>
-        <w:t xml:space="preserve">1.  </w:t>
-      </w:r>
-      <w:r>
-        <w:rPr>
-          <w:rFonts w:ascii="Calibri" w:cs="Calibri" w:eastAsia="Calibri" w:hAnsi="Calibri"/>
-          <w:b w:val="false"/>
-          <w:bCs w:val="false"/>
-          <w:i w:val="false"/>
-          <w:iCs w:val="false"/>
-          <w:color w:val="1A1A1A"/>
-          <w:sz w:val="22"/>
-          <w:szCs w:val="22"/>
-        </w:rPr>
-        <w:t xml:space="preserve">Visit github.com/KE4CON/APRS-Command</w:t>
-      </w:r>
-    </w:p>
-    <w:p>
-      <w:pPr>
-        <w:spacing w:after="60" w:before="60"/>
+          <w:b w:val="false"/>
+          <w:bCs w:val="false"/>
+          <w:i w:val="false"/>
+          <w:iCs w:val="false"/>
+          <w:color w:val="1A1A1A"/>
+          <w:sz w:val="22"/>
+          <w:szCs w:val="22"/>
+        </w:rPr>
+        <w:t xml:space="preserve">•  If you installed APRS Command with an installer, clicking the notification downloads the update and restarts the app into the new version automatically. Your settings are preserved.</w:t>
+      </w:r>
+    </w:p>
+    <w:p>
+      <w:pPr>
+        <w:spacing w:after="40" w:before="40"/>
         <w:ind w:left="720" w:hanging="360"/>
       </w:pPr>
       <w:r>
         <w:rPr>
           <w:rFonts w:ascii="Calibri" w:cs="Calibri" w:eastAsia="Calibri" w:hAnsi="Calibri"/>
-          <w:b/>
-          <w:bCs/>
-          <w:i w:val="false"/>
-          <w:iCs w:val="false"/>
-          <w:color w:val="1A56A0"/>
-          <w:sz w:val="22"/>
-          <w:szCs w:val="22"/>
-        </w:rPr>
-        <w:t xml:space="preserve">2.  </w:t>
-      </w:r>
-      <w:r>
-        <w:rPr>
-          <w:rFonts w:ascii="Calibri" w:cs="Calibri" w:eastAsia="Calibri" w:hAnsi="Calibri"/>
-          <w:b w:val="false"/>
-          <w:bCs w:val="false"/>
-          <w:i w:val="false"/>
-          <w:iCs w:val="false"/>
-          <w:color w:val="1A1A1A"/>
-          <w:sz w:val="22"/>
-          <w:szCs w:val="22"/>
-        </w:rPr>
-        <w:t xml:space="preserve">Click the Releases link on the right side of the page.</w:t>
-      </w:r>
-    </w:p>
-    <w:p>
-      <w:pPr>
-        <w:spacing w:after="60" w:before="60"/>
-        <w:ind w:left="720" w:hanging="360"/>
-      </w:pPr>
-      <w:r>
-        <w:rPr>
-          <w:rFonts w:ascii="Calibri" w:cs="Calibri" w:eastAsia="Calibri" w:hAnsi="Calibri"/>
-          <w:b/>
-          <w:bCs/>
-          <w:i w:val="false"/>
-          <w:iCs w:val="false"/>
-          <w:color w:val="1A56A0"/>
-          <w:sz w:val="22"/>
-          <w:szCs w:val="22"/>
-        </w:rPr>
-        <w:t xml:space="preserve">3.  </w:t>
-      </w:r>
-      <w:r>
-        <w:rPr>
-          <w:rFonts w:ascii="Calibri" w:cs="Calibri" w:eastAsia="Calibri" w:hAnsi="Calibri"/>
-          <w:b w:val="false"/>
-          <w:bCs w:val="false"/>
-          <w:i w:val="false"/>
-          <w:iCs w:val="false"/>
-          <w:color w:val="1A1A1A"/>
-          <w:sz w:val="22"/>
-          <w:szCs w:val="22"/>
-        </w:rPr>
-        <w:t xml:space="preserve">The latest release is shown at the top. Compare its version number to the one shown in APRS Command's About box (menu bar &gt; About APRS Command).</w:t>
-      </w:r>
-    </w:p>
-    <w:p>
-      <w:pPr>
-        <w:spacing w:after="60" w:before="60"/>
-        <w:ind w:left="720" w:hanging="360"/>
-      </w:pPr>
-      <w:r>
-        <w:rPr>
-          <w:rFonts w:ascii="Calibri" w:cs="Calibri" w:eastAsia="Calibri" w:hAnsi="Calibri"/>
-          <w:b/>
-          <w:bCs/>
-          <w:i w:val="false"/>
-          <w:iCs w:val="false"/>
-          <w:color w:val="1A56A0"/>
-          <w:sz w:val="22"/>
-          <w:szCs w:val="22"/>
-        </w:rPr>
-        <w:t xml:space="preserve">4.  </w:t>
-      </w:r>
-      <w:r>
-        <w:rPr>
-          <w:rFonts w:ascii="Calibri" w:cs="Calibri" w:eastAsia="Calibri" w:hAnsi="Calibri"/>
-          <w:b w:val="false"/>
-          <w:bCs w:val="false"/>
-          <w:i w:val="false"/>
-          <w:iCs w:val="false"/>
-          <w:color w:val="1A1A1A"/>
-          <w:sz w:val="22"/>
-          <w:szCs w:val="22"/>
-        </w:rPr>
-        <w:t xml:space="preserve">If a newer version is available, download the installer for your platform. Your settings are preserved.</w:t>
+          <w:b w:val="false"/>
+          <w:bCs w:val="false"/>
+          <w:i w:val="false"/>
+          <w:iCs w:val="false"/>
+          <w:color w:val="1A1A1A"/>
+          <w:sz w:val="22"/>
+          <w:szCs w:val="22"/>
+        </w:rPr>
+        <w:t xml:space="preserve">•  If you are running a portable (zip) copy, clicking the notification opens the GitHub releases page in your browser so you can download the new version.</w:t>
+      </w:r>
+    </w:p>
+    <w:p>
+      <w:pPr>
+        <w:keepNext w:val="false"/>
+        <w:spacing w:after="80" w:before="80" w:line="276" w:lineRule="auto"/>
+        <w:jc w:val="left"/>
+      </w:pPr>
+      <w:r>
+        <w:rPr>
+          <w:rFonts w:ascii="Calibri" w:cs="Calibri" w:eastAsia="Calibri" w:hAnsi="Calibri"/>
+          <w:b w:val="false"/>
+          <w:bCs w:val="false"/>
+          <w:i w:val="false"/>
+          <w:iCs w:val="false"/>
+          <w:color w:val="1A1A1A"/>
+          <w:sz w:val="22"/>
+          <w:szCs w:val="22"/>
+        </w:rPr>
+        <w:t xml:space="preserve">You can also check manually at any time: open About APRS Command from the menu bar, or visit github.com/KE4CON/APRS-Command/releases and compare the latest version against the one shown in the About box.</w:t>
       </w:r>
     </w:p>
     <w:tbl>
@@ -31051,7 +31020,467 @@
                 <w:sz w:val="21"/>
                 <w:szCs w:val="21"/>
               </w:rPr>
-              <w:t xml:space="preserve">An in-application update notification feature is planned for a future release.</w:t>
+              <w:t xml:space="preserve">The automatic check never blocks startup and never shows errors. No internet simply means no check — ideal for field deployments.</w:t>
+            </w:r>
+          </w:p>
+        </w:tc>
+      </w:tr>
+    </w:tbl>
+    <w:p>
+      <w:pPr>
+        <w:keepNext w:val="false"/>
+        <w:spacing w:after="0" w:before="0" w:line="276" w:lineRule="auto"/>
+        <w:jc w:val="left"/>
+      </w:pPr>
+      <w:r>
+        <w:rPr>
+          <w:rFonts w:ascii="Calibri" w:cs="Calibri" w:eastAsia="Calibri" w:hAnsi="Calibri"/>
+          <w:b w:val="false"/>
+          <w:bCs w:val="false"/>
+          <w:i w:val="false"/>
+          <w:iCs w:val="false"/>
+          <w:color w:val="1A1A1A"/>
+          <w:sz w:val="22"/>
+          <w:szCs w:val="22"/>
+        </w:rPr>
+        <w:t xml:space="preserve"/>
+      </w:r>
+    </w:p>
+    <w:p>
+      <w:pPr>
+        <w:keepNext/>
+        <w:pBdr>
+          <w:bottom w:val="single" w:color="D0D8E0" w:sz="4"/>
+        </w:pBdr>
+        <w:spacing w:after="80" w:before="280"/>
+      </w:pPr>
+      <w:r>
+        <w:rPr>
+          <w:rFonts w:ascii="Calibri" w:cs="Calibri" w:eastAsia="Calibri" w:hAnsi="Calibri"/>
+          <w:b/>
+          <w:bCs/>
+          <w:i w:val="false"/>
+          <w:iCs w:val="false"/>
+          <w:color w:val="1A56A0"/>
+          <w:sz w:val="24"/>
+          <w:szCs w:val="24"/>
+        </w:rPr>
+        <w:t xml:space="preserve">7.17  Mobile Companion Web View</w:t>
+      </w:r>
+    </w:p>
+    <w:p>
+      <w:pPr>
+        <w:keepNext w:val="false"/>
+        <w:spacing w:after="80" w:before="80" w:line="276" w:lineRule="auto"/>
+        <w:jc w:val="left"/>
+      </w:pPr>
+      <w:r>
+        <w:rPr>
+          <w:rFonts w:ascii="Calibri" w:cs="Calibri" w:eastAsia="Calibri" w:hAnsi="Calibri"/>
+          <w:b w:val="false"/>
+          <w:bCs w:val="false"/>
+          <w:i w:val="false"/>
+          <w:iCs w:val="false"/>
+          <w:color w:val="1A1A1A"/>
+          <w:sz w:val="22"/>
+          <w:szCs w:val="22"/>
+        </w:rPr>
+        <w:t xml:space="preserve">The Mobile Companion lets you monitor your APRS Command station from a phone or tablet on the same network. It serves a lightweight web dashboard showing your connection status, packet statistics, top stations, recent messages, and the net control roster.</w:t>
+      </w:r>
+    </w:p>
+    <w:p>
+      <w:pPr>
+        <w:spacing w:after="60" w:before="60"/>
+        <w:ind w:left="720" w:hanging="360"/>
+      </w:pPr>
+      <w:r>
+        <w:rPr>
+          <w:rFonts w:ascii="Calibri" w:cs="Calibri" w:eastAsia="Calibri" w:hAnsi="Calibri"/>
+          <w:b/>
+          <w:bCs/>
+          <w:i w:val="false"/>
+          <w:iCs w:val="false"/>
+          <w:color w:val="1A56A0"/>
+          <w:sz w:val="22"/>
+          <w:szCs w:val="22"/>
+        </w:rPr>
+        <w:t xml:space="preserve">1.  </w:t>
+      </w:r>
+      <w:r>
+        <w:rPr>
+          <w:rFonts w:ascii="Calibri" w:cs="Calibri" w:eastAsia="Calibri" w:hAnsi="Calibri"/>
+          <w:b w:val="false"/>
+          <w:bCs w:val="false"/>
+          <w:i w:val="false"/>
+          <w:iCs w:val="false"/>
+          <w:color w:val="1A1A1A"/>
+          <w:sz w:val="22"/>
+          <w:szCs w:val="22"/>
+        </w:rPr>
+        <w:t xml:space="preserve">Open Tools &gt; Mobile Companion Web View from the menu bar.</w:t>
+      </w:r>
+    </w:p>
+    <w:p>
+      <w:pPr>
+        <w:spacing w:after="60" w:before="60"/>
+        <w:ind w:left="720" w:hanging="360"/>
+      </w:pPr>
+      <w:r>
+        <w:rPr>
+          <w:rFonts w:ascii="Calibri" w:cs="Calibri" w:eastAsia="Calibri" w:hAnsi="Calibri"/>
+          <w:b/>
+          <w:bCs/>
+          <w:i w:val="false"/>
+          <w:iCs w:val="false"/>
+          <w:color w:val="1A56A0"/>
+          <w:sz w:val="22"/>
+          <w:szCs w:val="22"/>
+        </w:rPr>
+        <w:t xml:space="preserve">2.  </w:t>
+      </w:r>
+      <w:r>
+        <w:rPr>
+          <w:rFonts w:ascii="Calibri" w:cs="Calibri" w:eastAsia="Calibri" w:hAnsi="Calibri"/>
+          <w:b w:val="false"/>
+          <w:bCs w:val="false"/>
+          <w:i w:val="false"/>
+          <w:iCs w:val="false"/>
+          <w:color w:val="1A1A1A"/>
+          <w:sz w:val="22"/>
+          <w:szCs w:val="22"/>
+        </w:rPr>
+        <w:t xml:space="preserve">A window appears showing a URL such as http://192.168.1.50:52134/</w:t>
+      </w:r>
+    </w:p>
+    <w:p>
+      <w:pPr>
+        <w:spacing w:after="60" w:before="60"/>
+        <w:ind w:left="720" w:hanging="360"/>
+      </w:pPr>
+      <w:r>
+        <w:rPr>
+          <w:rFonts w:ascii="Calibri" w:cs="Calibri" w:eastAsia="Calibri" w:hAnsi="Calibri"/>
+          <w:b/>
+          <w:bCs/>
+          <w:i w:val="false"/>
+          <w:iCs w:val="false"/>
+          <w:color w:val="1A56A0"/>
+          <w:sz w:val="22"/>
+          <w:szCs w:val="22"/>
+        </w:rPr>
+        <w:t xml:space="preserve">3.  </w:t>
+      </w:r>
+      <w:r>
+        <w:rPr>
+          <w:rFonts w:ascii="Calibri" w:cs="Calibri" w:eastAsia="Calibri" w:hAnsi="Calibri"/>
+          <w:b w:val="false"/>
+          <w:bCs w:val="false"/>
+          <w:i w:val="false"/>
+          <w:iCs w:val="false"/>
+          <w:color w:val="1A1A1A"/>
+          <w:sz w:val="22"/>
+          <w:szCs w:val="22"/>
+        </w:rPr>
+        <w:t xml:space="preserve">On your phone, connect to the same WiFi network as the computer running APRS Command.</w:t>
+      </w:r>
+    </w:p>
+    <w:p>
+      <w:pPr>
+        <w:spacing w:after="60" w:before="60"/>
+        <w:ind w:left="720" w:hanging="360"/>
+      </w:pPr>
+      <w:r>
+        <w:rPr>
+          <w:rFonts w:ascii="Calibri" w:cs="Calibri" w:eastAsia="Calibri" w:hAnsi="Calibri"/>
+          <w:b/>
+          <w:bCs/>
+          <w:i w:val="false"/>
+          <w:iCs w:val="false"/>
+          <w:color w:val="1A56A0"/>
+          <w:sz w:val="22"/>
+          <w:szCs w:val="22"/>
+        </w:rPr>
+        <w:t xml:space="preserve">4.  </w:t>
+      </w:r>
+      <w:r>
+        <w:rPr>
+          <w:rFonts w:ascii="Calibri" w:cs="Calibri" w:eastAsia="Calibri" w:hAnsi="Calibri"/>
+          <w:b w:val="false"/>
+          <w:bCs w:val="false"/>
+          <w:i w:val="false"/>
+          <w:iCs w:val="false"/>
+          <w:color w:val="1A1A1A"/>
+          <w:sz w:val="22"/>
+          <w:szCs w:val="22"/>
+        </w:rPr>
+        <w:t xml:space="preserve">Open the phone's web browser and enter the URL exactly as shown.</w:t>
+      </w:r>
+    </w:p>
+    <w:p>
+      <w:pPr>
+        <w:spacing w:after="60" w:before="60"/>
+        <w:ind w:left="720" w:hanging="360"/>
+      </w:pPr>
+      <w:r>
+        <w:rPr>
+          <w:rFonts w:ascii="Calibri" w:cs="Calibri" w:eastAsia="Calibri" w:hAnsi="Calibri"/>
+          <w:b/>
+          <w:bCs/>
+          <w:i w:val="false"/>
+          <w:iCs w:val="false"/>
+          <w:color w:val="1A56A0"/>
+          <w:sz w:val="22"/>
+          <w:szCs w:val="22"/>
+        </w:rPr>
+        <w:t xml:space="preserve">5.  </w:t>
+      </w:r>
+      <w:r>
+        <w:rPr>
+          <w:rFonts w:ascii="Calibri" w:cs="Calibri" w:eastAsia="Calibri" w:hAnsi="Calibri"/>
+          <w:b w:val="false"/>
+          <w:bCs w:val="false"/>
+          <w:i w:val="false"/>
+          <w:iCs w:val="false"/>
+          <w:color w:val="1A1A1A"/>
+          <w:sz w:val="22"/>
+          <w:szCs w:val="22"/>
+        </w:rPr>
+        <w:t xml:space="preserve">The dashboard loads and refreshes automatically while APRS Command is running.</w:t>
+      </w:r>
+    </w:p>
+    <w:tbl>
+      <w:tblPr>
+        <w:tblW w:type="dxa" w:w="10080"/>
+        <w:tblBorders>
+          <w:top w:val="single" w:color="auto" w:sz="4"/>
+          <w:left w:val="single" w:color="auto" w:sz="4"/>
+          <w:bottom w:val="single" w:color="auto" w:sz="4"/>
+          <w:right w:val="single" w:color="auto" w:sz="4"/>
+          <w:insideH w:val="single" w:color="auto" w:sz="4"/>
+          <w:insideV w:val="single" w:color="auto" w:sz="4"/>
+        </w:tblBorders>
+      </w:tblPr>
+      <w:tblGrid>
+        <w:gridCol w:w="140"/>
+        <w:gridCol w:w="9940"/>
+      </w:tblGrid>
+      <w:tr>
+        <w:tc>
+          <w:tcPr>
+            <w:tcW w:type="dxa" w:w="140"/>
+            <w:tcBorders>
+              <w:top w:val="none"/>
+              <w:left w:val="none"/>
+              <w:bottom w:val="none"/>
+              <w:right w:val="none"/>
+            </w:tcBorders>
+            <w:shd w:fill="C0392B" w:color="auto" w:val="clear"/>
+          </w:tcPr>
+          <w:p>
+            <w:pPr>
+              <w:keepNext w:val="false"/>
+              <w:spacing w:after="0" w:before="0" w:line="276" w:lineRule="auto"/>
+              <w:jc w:val="left"/>
+            </w:pPr>
+            <w:r>
+              <w:rPr>
+                <w:rFonts w:ascii="Calibri" w:cs="Calibri" w:eastAsia="Calibri" w:hAnsi="Calibri"/>
+                <w:b w:val="false"/>
+                <w:bCs w:val="false"/>
+                <w:i w:val="false"/>
+                <w:iCs w:val="false"/>
+                <w:color w:val="1A1A1A"/>
+                <w:sz w:val="22"/>
+                <w:szCs w:val="22"/>
+              </w:rPr>
+              <w:t xml:space="preserve"/>
+            </w:r>
+          </w:p>
+        </w:tc>
+        <w:tc>
+          <w:tcPr>
+            <w:tcW w:type="dxa" w:w="9940"/>
+            <w:tcBorders>
+              <w:top w:val="none"/>
+              <w:left w:val="none"/>
+              <w:bottom w:val="none"/>
+              <w:right w:val="none"/>
+            </w:tcBorders>
+            <w:shd w:fill="FFF1F0" w:color="auto" w:val="clear"/>
+            <w:tcMar>
+              <w:top w:type="dxa" w:w="120"/>
+              <w:left w:type="dxa" w:w="200"/>
+              <w:bottom w:type="dxa" w:w="120"/>
+              <w:right w:type="dxa" w:w="200"/>
+            </w:tcMar>
+          </w:tcPr>
+          <w:p>
+            <w:pPr>
+              <w:keepNext w:val="false"/>
+              <w:spacing w:after="40" w:before="0" w:line="276" w:lineRule="auto"/>
+              <w:jc w:val="left"/>
+            </w:pPr>
+            <w:r>
+              <w:rPr>
+                <w:rFonts w:ascii="Calibri" w:cs="Calibri" w:eastAsia="Calibri" w:hAnsi="Calibri"/>
+                <w:b/>
+                <w:bCs/>
+                <w:i w:val="false"/>
+                <w:iCs w:val="false"/>
+                <w:color w:val="C0392B"/>
+                <w:sz w:val="20"/>
+                <w:szCs w:val="20"/>
+              </w:rPr>
+              <w:t xml:space="preserve">🔴  Important</w:t>
+            </w:r>
+          </w:p>
+          <w:p>
+            <w:pPr>
+              <w:keepNext w:val="false"/>
+              <w:spacing w:after="0" w:before="40" w:line="276" w:lineRule="auto"/>
+              <w:jc w:val="left"/>
+            </w:pPr>
+            <w:r>
+              <w:rPr>
+                <w:rFonts w:ascii="Calibri" w:cs="Calibri" w:eastAsia="Calibri" w:hAnsi="Calibri"/>
+                <w:b w:val="false"/>
+                <w:bCs w:val="false"/>
+                <w:i w:val="false"/>
+                <w:iCs w:val="false"/>
+                <w:color w:val="1A1A1A"/>
+                <w:sz w:val="21"/>
+                <w:szCs w:val="21"/>
+              </w:rPr>
+              <w:t xml:space="preserve">The Mobile Companion has no password and uses unencrypted HTTP. Anyone on the same network can open the dashboard if they know the address. This is fine on your home network or a private field network you control — but avoid using it on public WiFi (hotels, coffee shops, event venues with open networks), where strangers share the same network.</w:t>
+            </w:r>
+          </w:p>
+        </w:tc>
+      </w:tr>
+    </w:tbl>
+    <w:p>
+      <w:pPr>
+        <w:keepNext w:val="false"/>
+        <w:spacing w:after="0" w:before="0" w:line="276" w:lineRule="auto"/>
+        <w:jc w:val="left"/>
+      </w:pPr>
+      <w:r>
+        <w:rPr>
+          <w:rFonts w:ascii="Calibri" w:cs="Calibri" w:eastAsia="Calibri" w:hAnsi="Calibri"/>
+          <w:b w:val="false"/>
+          <w:bCs w:val="false"/>
+          <w:i w:val="false"/>
+          <w:iCs w:val="false"/>
+          <w:color w:val="1A1A1A"/>
+          <w:sz w:val="22"/>
+          <w:szCs w:val="22"/>
+        </w:rPr>
+        <w:t xml:space="preserve"/>
+      </w:r>
+    </w:p>
+    <w:tbl>
+      <w:tblPr>
+        <w:tblW w:type="dxa" w:w="10080"/>
+        <w:tblBorders>
+          <w:top w:val="single" w:color="auto" w:sz="4"/>
+          <w:left w:val="single" w:color="auto" w:sz="4"/>
+          <w:bottom w:val="single" w:color="auto" w:sz="4"/>
+          <w:right w:val="single" w:color="auto" w:sz="4"/>
+          <w:insideH w:val="single" w:color="auto" w:sz="4"/>
+          <w:insideV w:val="single" w:color="auto" w:sz="4"/>
+        </w:tblBorders>
+      </w:tblPr>
+      <w:tblGrid>
+        <w:gridCol w:w="140"/>
+        <w:gridCol w:w="9940"/>
+      </w:tblGrid>
+      <w:tr>
+        <w:tc>
+          <w:tcPr>
+            <w:tcW w:type="dxa" w:w="140"/>
+            <w:tcBorders>
+              <w:top w:val="none"/>
+              <w:left w:val="none"/>
+              <w:bottom w:val="none"/>
+              <w:right w:val="none"/>
+            </w:tcBorders>
+            <w:shd w:fill="6B7E91" w:color="auto" w:val="clear"/>
+          </w:tcPr>
+          <w:p>
+            <w:pPr>
+              <w:keepNext w:val="false"/>
+              <w:spacing w:after="0" w:before="0" w:line="276" w:lineRule="auto"/>
+              <w:jc w:val="left"/>
+            </w:pPr>
+            <w:r>
+              <w:rPr>
+                <w:rFonts w:ascii="Calibri" w:cs="Calibri" w:eastAsia="Calibri" w:hAnsi="Calibri"/>
+                <w:b w:val="false"/>
+                <w:bCs w:val="false"/>
+                <w:i w:val="false"/>
+                <w:iCs w:val="false"/>
+                <w:color w:val="1A1A1A"/>
+                <w:sz w:val="22"/>
+                <w:szCs w:val="22"/>
+              </w:rPr>
+              <w:t xml:space="preserve"/>
+            </w:r>
+          </w:p>
+        </w:tc>
+        <w:tc>
+          <w:tcPr>
+            <w:tcW w:type="dxa" w:w="9940"/>
+            <w:tcBorders>
+              <w:top w:val="none"/>
+              <w:left w:val="none"/>
+              <w:bottom w:val="none"/>
+              <w:right w:val="none"/>
+            </w:tcBorders>
+            <w:shd w:fill="F0F4F8" w:color="auto" w:val="clear"/>
+            <w:tcMar>
+              <w:top w:type="dxa" w:w="120"/>
+              <w:left w:type="dxa" w:w="200"/>
+              <w:bottom w:type="dxa" w:w="120"/>
+              <w:right w:type="dxa" w:w="200"/>
+            </w:tcMar>
+          </w:tcPr>
+          <w:p>
+            <w:pPr>
+              <w:keepNext w:val="false"/>
+              <w:spacing w:after="40" w:before="0" w:line="276" w:lineRule="auto"/>
+              <w:jc w:val="left"/>
+            </w:pPr>
+            <w:r>
+              <w:rPr>
+                <w:rFonts w:ascii="Calibri" w:cs="Calibri" w:eastAsia="Calibri" w:hAnsi="Calibri"/>
+                <w:b/>
+                <w:bCs/>
+                <w:i w:val="false"/>
+                <w:iCs w:val="false"/>
+                <w:color w:val="6B7E91"/>
+                <w:sz w:val="20"/>
+                <w:szCs w:val="20"/>
+              </w:rPr>
+              <w:t xml:space="preserve">📝  Note</w:t>
+            </w:r>
+          </w:p>
+          <w:p>
+            <w:pPr>
+              <w:keepNext w:val="false"/>
+              <w:spacing w:after="0" w:before="40" w:line="276" w:lineRule="auto"/>
+              <w:jc w:val="left"/>
+            </w:pPr>
+            <w:r>
+              <w:rPr>
+                <w:rFonts w:ascii="Calibri" w:cs="Calibri" w:eastAsia="Calibri" w:hAnsi="Calibri"/>
+                <w:b w:val="false"/>
+                <w:bCs w:val="false"/>
+                <w:i w:val="false"/>
+                <w:iCs w:val="false"/>
+                <w:color w:val="1A1A1A"/>
+                <w:sz w:val="21"/>
+                <w:szCs w:val="21"/>
+              </w:rPr>
+              <w:t xml:space="preserve">The dashboard is read-only — it displays information but cannot transmit, change settings, or control the station. Firewall software on your computer may ask permission the first time the companion starts; allow access on private networks.</w:t>
             </w:r>
           </w:p>
         </w:tc>

</xml_diff>

<commit_message>
User manual v2.2: CalTopo integration, GPX/KML import/export
</commit_message>
<xml_diff>
--- a/docs/APRS_Command_User_Manual.docx
+++ b/docs/APRS_Command_User_Manual.docx
@@ -1742,13 +1742,12 @@
           <w:sz w:val="21"/>
           <w:szCs w:val="21"/>
         </w:rPr>
-        <w:t xml:space="preserve">7.5  Draw Tools</w:t>
+        <w:t xml:space="preserve">7.5  Draw Tools and Map Import/Export</w:t>
       </w:r>
     </w:p>
     <w:p>
       <w:pPr>
         <w:spacing w:after="40" w:before="40"/>
-        <w:ind w:left="360"/>
       </w:pPr>
       <w:r>
         <w:rPr>
@@ -1761,13 +1760,12 @@
           <w:sz w:val="21"/>
           <w:szCs w:val="21"/>
         </w:rPr>
-        <w:t xml:space="preserve">7.6  Weather</w:t>
+        <w:t xml:space="preserve">7.5.1  Importing GPX and KML Files</w:t>
       </w:r>
     </w:p>
     <w:p>
       <w:pPr>
         <w:spacing w:after="40" w:before="40"/>
-        <w:ind w:left="360"/>
       </w:pPr>
       <w:r>
         <w:rPr>
@@ -1780,7 +1778,7 @@
           <w:sz w:val="21"/>
           <w:szCs w:val="21"/>
         </w:rPr>
-        <w:t xml:space="preserve">7.7  Tools</w:t>
+        <w:t xml:space="preserve">7.5.2  Exporting Drawings as GPX or KML</w:t>
       </w:r>
     </w:p>
     <w:p>
@@ -1799,13 +1797,12 @@
           <w:sz w:val="21"/>
           <w:szCs w:val="21"/>
         </w:rPr>
-        <w:t xml:space="preserve">7.8  Packet Statistics Dashboard</w:t>
+        <w:t xml:space="preserve">7.6  CalTopo / SARTopo Integration</w:t>
       </w:r>
     </w:p>
     <w:p>
       <w:pPr>
         <w:spacing w:after="40" w:before="40"/>
-        <w:ind w:left="360"/>
       </w:pPr>
       <w:r>
         <w:rPr>
@@ -1818,13 +1815,12 @@
           <w:sz w:val="21"/>
           <w:szCs w:val="21"/>
         </w:rPr>
-        <w:t xml:space="preserve">7.9  Session Templates</w:t>
+        <w:t xml:space="preserve">7.6.1  File-Based Exchange (GPX and KML)</w:t>
       </w:r>
     </w:p>
     <w:p>
       <w:pPr>
         <w:spacing w:after="40" w:before="40"/>
-        <w:ind w:left="360"/>
       </w:pPr>
       <w:r>
         <w:rPr>
@@ -1837,7 +1833,7 @@
           <w:sz w:val="21"/>
           <w:szCs w:val="21"/>
         </w:rPr>
-        <w:t xml:space="preserve">7.10  Voice Readout</w:t>
+        <w:t xml:space="preserve">7.6.2  Live Position Forwarding</w:t>
       </w:r>
     </w:p>
     <w:p>
@@ -1856,7 +1852,7 @@
           <w:sz w:val="21"/>
           <w:szCs w:val="21"/>
         </w:rPr>
-        <w:t xml:space="preserve">7.11  Events — ICS Documentation</w:t>
+        <w:t xml:space="preserve">7.7  Weather</w:t>
       </w:r>
     </w:p>
     <w:p>
@@ -1875,7 +1871,7 @@
           <w:sz w:val="21"/>
           <w:szCs w:val="21"/>
         </w:rPr>
-        <w:t xml:space="preserve">7.12  Telemetry Monitor</w:t>
+        <w:t xml:space="preserve">7.8  Tools</w:t>
       </w:r>
     </w:p>
     <w:p>
@@ -1894,7 +1890,7 @@
           <w:sz w:val="21"/>
           <w:szCs w:val="21"/>
         </w:rPr>
-        <w:t xml:space="preserve">7.13  Scheduled Beacons</w:t>
+        <w:t xml:space="preserve">7.9  Packet Statistics Dashboard</w:t>
       </w:r>
     </w:p>
     <w:p>
@@ -1913,7 +1909,7 @@
           <w:sz w:val="21"/>
           <w:szCs w:val="21"/>
         </w:rPr>
-        <w:t xml:space="preserve">7.14  Keyboard Shortcuts</w:t>
+        <w:t xml:space="preserve">7.10  Session Templates</w:t>
       </w:r>
     </w:p>
     <w:p>
@@ -1932,7 +1928,7 @@
           <w:sz w:val="21"/>
           <w:szCs w:val="21"/>
         </w:rPr>
-        <w:t xml:space="preserve">7.15  Dead Reckoning</w:t>
+        <w:t xml:space="preserve">7.11  Voice Readout</w:t>
       </w:r>
     </w:p>
     <w:p>
@@ -1951,7 +1947,7 @@
           <w:sz w:val="21"/>
           <w:szCs w:val="21"/>
         </w:rPr>
-        <w:t xml:space="preserve">7.16  Software Updates</w:t>
+        <w:t xml:space="preserve">7.12  Events — ICS Documentation</w:t>
       </w:r>
     </w:p>
     <w:p>
@@ -1970,7 +1966,102 @@
           <w:sz w:val="21"/>
           <w:szCs w:val="21"/>
         </w:rPr>
-        <w:t xml:space="preserve">7.17  Mobile Companion Web View</w:t>
+        <w:t xml:space="preserve">7.13  Telemetry Monitor</w:t>
+      </w:r>
+    </w:p>
+    <w:p>
+      <w:pPr>
+        <w:spacing w:after="40" w:before="40"/>
+        <w:ind w:left="360"/>
+      </w:pPr>
+      <w:r>
+        <w:rPr>
+          <w:rFonts w:ascii="Calibri" w:cs="Calibri" w:eastAsia="Calibri" w:hAnsi="Calibri"/>
+          <w:b w:val="false"/>
+          <w:bCs w:val="false"/>
+          <w:i w:val="false"/>
+          <w:iCs w:val="false"/>
+          <w:color w:val="4A4A4A"/>
+          <w:sz w:val="21"/>
+          <w:szCs w:val="21"/>
+        </w:rPr>
+        <w:t xml:space="preserve">7.14  Scheduled Beacons</w:t>
+      </w:r>
+    </w:p>
+    <w:p>
+      <w:pPr>
+        <w:spacing w:after="40" w:before="40"/>
+        <w:ind w:left="360"/>
+      </w:pPr>
+      <w:r>
+        <w:rPr>
+          <w:rFonts w:ascii="Calibri" w:cs="Calibri" w:eastAsia="Calibri" w:hAnsi="Calibri"/>
+          <w:b w:val="false"/>
+          <w:bCs w:val="false"/>
+          <w:i w:val="false"/>
+          <w:iCs w:val="false"/>
+          <w:color w:val="4A4A4A"/>
+          <w:sz w:val="21"/>
+          <w:szCs w:val="21"/>
+        </w:rPr>
+        <w:t xml:space="preserve">7.15  Keyboard Shortcuts</w:t>
+      </w:r>
+    </w:p>
+    <w:p>
+      <w:pPr>
+        <w:spacing w:after="40" w:before="40"/>
+        <w:ind w:left="360"/>
+      </w:pPr>
+      <w:r>
+        <w:rPr>
+          <w:rFonts w:ascii="Calibri" w:cs="Calibri" w:eastAsia="Calibri" w:hAnsi="Calibri"/>
+          <w:b w:val="false"/>
+          <w:bCs w:val="false"/>
+          <w:i w:val="false"/>
+          <w:iCs w:val="false"/>
+          <w:color w:val="4A4A4A"/>
+          <w:sz w:val="21"/>
+          <w:szCs w:val="21"/>
+        </w:rPr>
+        <w:t xml:space="preserve">7.16  Dead Reckoning</w:t>
+      </w:r>
+    </w:p>
+    <w:p>
+      <w:pPr>
+        <w:spacing w:after="40" w:before="40"/>
+        <w:ind w:left="360"/>
+      </w:pPr>
+      <w:r>
+        <w:rPr>
+          <w:rFonts w:ascii="Calibri" w:cs="Calibri" w:eastAsia="Calibri" w:hAnsi="Calibri"/>
+          <w:b w:val="false"/>
+          <w:bCs w:val="false"/>
+          <w:i w:val="false"/>
+          <w:iCs w:val="false"/>
+          <w:color w:val="4A4A4A"/>
+          <w:sz w:val="21"/>
+          <w:szCs w:val="21"/>
+        </w:rPr>
+        <w:t xml:space="preserve">7.17  Software Updates</w:t>
+      </w:r>
+    </w:p>
+    <w:p>
+      <w:pPr>
+        <w:spacing w:after="40" w:before="40"/>
+        <w:ind w:left="360"/>
+      </w:pPr>
+      <w:r>
+        <w:rPr>
+          <w:rFonts w:ascii="Calibri" w:cs="Calibri" w:eastAsia="Calibri" w:hAnsi="Calibri"/>
+          <w:b w:val="false"/>
+          <w:bCs w:val="false"/>
+          <w:i w:val="false"/>
+          <w:iCs w:val="false"/>
+          <w:color w:val="4A4A4A"/>
+          <w:sz w:val="21"/>
+          <w:szCs w:val="21"/>
+        </w:rPr>
+        <w:t xml:space="preserve">7.18  Mobile Companion Web View</w:t>
       </w:r>
     </w:p>
     <w:p>
@@ -20462,7 +20553,7 @@
           <w:sz w:val="24"/>
           <w:szCs w:val="24"/>
         </w:rPr>
-        <w:t xml:space="preserve">7.5  Draw Tools</w:t>
+        <w:t xml:space="preserve">7.5  Draw Tools and Map Import/Export</w:t>
       </w:r>
     </w:p>
     <w:p>
@@ -20482,7 +20573,7 @@
           <w:sz w:val="22"/>
           <w:szCs w:val="22"/>
         </w:rPr>
-        <w:t xml:space="preserve">Draw shapes on the map for planning, briefing, or annotation. Drawings are visible only locally — never transmitted.</w:t>
+        <w:t xml:space="preserve">Draw shapes on the map for planning, briefing, or annotation. Drawings are visible only locally — never transmitted over APRS.</w:t>
       </w:r>
     </w:p>
     <w:p>
@@ -20501,7 +20592,7 @@
           <w:sz w:val="22"/>
           <w:szCs w:val="22"/>
         </w:rPr>
-        <w:t xml:space="preserve">•  Draw Line — click two or more points to draw a path.</w:t>
+        <w:t xml:space="preserve">•  Draw Line — click two or more points to draw a path. Double-click to finish.</w:t>
       </w:r>
     </w:p>
     <w:p>
@@ -20520,7 +20611,7 @@
           <w:sz w:val="22"/>
           <w:szCs w:val="22"/>
         </w:rPr>
-        <w:t xml:space="preserve">•  Draw Polygon — click three or more points to draw an area.</w:t>
+        <w:t xml:space="preserve">•  Draw Polygon — click three or more points to draw a filled area. Double-click to close.</w:t>
       </w:r>
     </w:p>
     <w:p>
@@ -20712,6 +20803,440 @@
     <w:p>
       <w:pPr>
         <w:keepNext/>
+        <w:spacing w:after="40" w:before="200"/>
+      </w:pPr>
+      <w:r>
+        <w:rPr>
+          <w:rFonts w:ascii="Calibri" w:cs="Calibri" w:eastAsia="Calibri" w:hAnsi="Calibri"/>
+          <w:b/>
+          <w:bCs/>
+          <w:i w:val="false"/>
+          <w:iCs w:val="false"/>
+          <w:color w:val="0F2A4A"/>
+          <w:sz w:val="22"/>
+          <w:szCs w:val="22"/>
+        </w:rPr>
+        <w:t xml:space="preserve">7.5.1  Importing GPX and KML Files</w:t>
+      </w:r>
+    </w:p>
+    <w:p>
+      <w:pPr>
+        <w:keepNext w:val="false"/>
+        <w:spacing w:after="80" w:before="80" w:line="276" w:lineRule="auto"/>
+        <w:jc w:val="left"/>
+      </w:pPr>
+      <w:r>
+        <w:rPr>
+          <w:rFonts w:ascii="Calibri" w:cs="Calibri" w:eastAsia="Calibri" w:hAnsi="Calibri"/>
+          <w:b w:val="false"/>
+          <w:bCs w:val="false"/>
+          <w:i w:val="false"/>
+          <w:iCs w:val="false"/>
+          <w:color w:val="1A1A1A"/>
+          <w:sz w:val="22"/>
+          <w:szCs w:val="22"/>
+        </w:rPr>
+        <w:t xml:space="preserve">APRS Command can import route files, track logs, and waypoint collections from GPS devices, mapping software, and field planning tools. Use File &gt; Map &gt; Import GPX/KML to open a file.</w:t>
+      </w:r>
+    </w:p>
+    <w:p>
+      <w:pPr>
+        <w:keepNext w:val="false"/>
+        <w:spacing w:after="80" w:before="80" w:line="276" w:lineRule="auto"/>
+        <w:jc w:val="left"/>
+      </w:pPr>
+      <w:r>
+        <w:rPr>
+          <w:rFonts w:ascii="Calibri" w:cs="Calibri" w:eastAsia="Calibri" w:hAnsi="Calibri"/>
+          <w:b w:val="false"/>
+          <w:bCs w:val="false"/>
+          <w:i w:val="false"/>
+          <w:iCs w:val="false"/>
+          <w:color w:val="1A1A1A"/>
+          <w:sz w:val="22"/>
+          <w:szCs w:val="22"/>
+        </w:rPr>
+        <w:t xml:space="preserve">Supported formats:</w:t>
+      </w:r>
+    </w:p>
+    <w:p>
+      <w:pPr>
+        <w:spacing w:after="40" w:before="40"/>
+        <w:ind w:left="720" w:hanging="360"/>
+      </w:pPr>
+      <w:r>
+        <w:rPr>
+          <w:rFonts w:ascii="Calibri" w:cs="Calibri" w:eastAsia="Calibri" w:hAnsi="Calibri"/>
+          <w:b w:val="false"/>
+          <w:bCs w:val="false"/>
+          <w:i w:val="false"/>
+          <w:iCs w:val="false"/>
+          <w:color w:val="1A1A1A"/>
+          <w:sz w:val="22"/>
+          <w:szCs w:val="22"/>
+        </w:rPr>
+        <w:t xml:space="preserve">•  GPX (GPS Exchange Format) — the standard format for Garmin devices, Strava, AllTrails, and most GPS units. Tracks, routes, and waypoints are all imported.</w:t>
+      </w:r>
+    </w:p>
+    <w:p>
+      <w:pPr>
+        <w:spacing w:after="40" w:before="40"/>
+        <w:ind w:left="720" w:hanging="360"/>
+      </w:pPr>
+      <w:r>
+        <w:rPr>
+          <w:rFonts w:ascii="Calibri" w:cs="Calibri" w:eastAsia="Calibri" w:hAnsi="Calibri"/>
+          <w:b w:val="false"/>
+          <w:bCs w:val="false"/>
+          <w:i w:val="false"/>
+          <w:iCs w:val="false"/>
+          <w:color w:val="1A1A1A"/>
+          <w:sz w:val="22"/>
+          <w:szCs w:val="22"/>
+        </w:rPr>
+        <w:t xml:space="preserve">•  KML (Keyhole Markup Language) — the format used by Google Earth, CalTopo, and many GIS tools. Points, lines, and polygons are imported.</w:t>
+      </w:r>
+    </w:p>
+    <w:p>
+      <w:pPr>
+        <w:keepNext w:val="false"/>
+        <w:spacing w:after="80" w:before="80" w:line="276" w:lineRule="auto"/>
+        <w:jc w:val="left"/>
+      </w:pPr>
+      <w:r>
+        <w:rPr>
+          <w:rFonts w:ascii="Calibri" w:cs="Calibri" w:eastAsia="Calibri" w:hAnsi="Calibri"/>
+          <w:b w:val="false"/>
+          <w:bCs w:val="false"/>
+          <w:i w:val="false"/>
+          <w:iCs w:val="false"/>
+          <w:color w:val="1A1A1A"/>
+          <w:sz w:val="22"/>
+          <w:szCs w:val="22"/>
+        </w:rPr>
+        <w:t xml:space="preserve">Imported geometry appears in the drawing layer on the map immediately. Tracks appear in APRS blue, routes in gold, and waypoints as labeled dot markers. All imported shapes can be erased using the Erase tool.</w:t>
+      </w:r>
+    </w:p>
+    <w:tbl>
+      <w:tblPr>
+        <w:tblW w:type="dxa" w:w="10080"/>
+        <w:tblBorders>
+          <w:top w:val="single" w:color="auto" w:sz="4"/>
+          <w:left w:val="single" w:color="auto" w:sz="4"/>
+          <w:bottom w:val="single" w:color="auto" w:sz="4"/>
+          <w:right w:val="single" w:color="auto" w:sz="4"/>
+          <w:insideH w:val="single" w:color="auto" w:sz="4"/>
+          <w:insideV w:val="single" w:color="auto" w:sz="4"/>
+        </w:tblBorders>
+      </w:tblPr>
+      <w:tblGrid>
+        <w:gridCol w:w="140"/>
+        <w:gridCol w:w="9940"/>
+      </w:tblGrid>
+      <w:tr>
+        <w:tc>
+          <w:tcPr>
+            <w:tcW w:type="dxa" w:w="140"/>
+            <w:tcBorders>
+              <w:top w:val="none"/>
+              <w:left w:val="none"/>
+              <w:bottom w:val="none"/>
+              <w:right w:val="none"/>
+            </w:tcBorders>
+            <w:shd w:fill="6B7E91" w:color="auto" w:val="clear"/>
+          </w:tcPr>
+          <w:p>
+            <w:pPr>
+              <w:keepNext w:val="false"/>
+              <w:spacing w:after="0" w:before="0" w:line="276" w:lineRule="auto"/>
+              <w:jc w:val="left"/>
+            </w:pPr>
+            <w:r>
+              <w:rPr>
+                <w:rFonts w:ascii="Calibri" w:cs="Calibri" w:eastAsia="Calibri" w:hAnsi="Calibri"/>
+                <w:b w:val="false"/>
+                <w:bCs w:val="false"/>
+                <w:i w:val="false"/>
+                <w:iCs w:val="false"/>
+                <w:color w:val="1A1A1A"/>
+                <w:sz w:val="22"/>
+                <w:szCs w:val="22"/>
+              </w:rPr>
+              <w:t xml:space="preserve"/>
+            </w:r>
+          </w:p>
+        </w:tc>
+        <w:tc>
+          <w:tcPr>
+            <w:tcW w:type="dxa" w:w="9940"/>
+            <w:tcBorders>
+              <w:top w:val="none"/>
+              <w:left w:val="none"/>
+              <w:bottom w:val="none"/>
+              <w:right w:val="none"/>
+            </w:tcBorders>
+            <w:shd w:fill="F0F4F8" w:color="auto" w:val="clear"/>
+            <w:tcMar>
+              <w:top w:type="dxa" w:w="120"/>
+              <w:left w:type="dxa" w:w="200"/>
+              <w:bottom w:type="dxa" w:w="120"/>
+              <w:right w:type="dxa" w:w="200"/>
+            </w:tcMar>
+          </w:tcPr>
+          <w:p>
+            <w:pPr>
+              <w:keepNext w:val="false"/>
+              <w:spacing w:after="40" w:before="0" w:line="276" w:lineRule="auto"/>
+              <w:jc w:val="left"/>
+            </w:pPr>
+            <w:r>
+              <w:rPr>
+                <w:rFonts w:ascii="Calibri" w:cs="Calibri" w:eastAsia="Calibri" w:hAnsi="Calibri"/>
+                <w:b/>
+                <w:bCs/>
+                <w:i w:val="false"/>
+                <w:iCs w:val="false"/>
+                <w:color w:val="6B7E91"/>
+                <w:sz w:val="20"/>
+                <w:szCs w:val="20"/>
+              </w:rPr>
+              <w:t xml:space="preserve">📝  Note</w:t>
+            </w:r>
+          </w:p>
+          <w:p>
+            <w:pPr>
+              <w:keepNext w:val="false"/>
+              <w:spacing w:after="0" w:before="40" w:line="276" w:lineRule="auto"/>
+              <w:jc w:val="left"/>
+            </w:pPr>
+            <w:r>
+              <w:rPr>
+                <w:rFonts w:ascii="Calibri" w:cs="Calibri" w:eastAsia="Calibri" w:hAnsi="Calibri"/>
+                <w:b w:val="false"/>
+                <w:bCs w:val="false"/>
+                <w:i w:val="false"/>
+                <w:iCs w:val="false"/>
+                <w:color w:val="1A1A1A"/>
+                <w:sz w:val="21"/>
+                <w:szCs w:val="21"/>
+              </w:rPr>
+              <w:t xml:space="preserve">KMZ files (zipped KML) are not directly supported. To import a KMZ file, rename it to .zip, extract it using your operating system, and open the .kml file inside.</w:t>
+            </w:r>
+          </w:p>
+        </w:tc>
+      </w:tr>
+    </w:tbl>
+    <w:p>
+      <w:pPr>
+        <w:keepNext w:val="false"/>
+        <w:spacing w:after="0" w:before="0" w:line="276" w:lineRule="auto"/>
+        <w:jc w:val="left"/>
+      </w:pPr>
+      <w:r>
+        <w:rPr>
+          <w:rFonts w:ascii="Calibri" w:cs="Calibri" w:eastAsia="Calibri" w:hAnsi="Calibri"/>
+          <w:b w:val="false"/>
+          <w:bCs w:val="false"/>
+          <w:i w:val="false"/>
+          <w:iCs w:val="false"/>
+          <w:color w:val="1A1A1A"/>
+          <w:sz w:val="22"/>
+          <w:szCs w:val="22"/>
+        </w:rPr>
+        <w:t xml:space="preserve"/>
+      </w:r>
+    </w:p>
+    <w:p>
+      <w:pPr>
+        <w:keepNext/>
+        <w:spacing w:after="40" w:before="200"/>
+      </w:pPr>
+      <w:r>
+        <w:rPr>
+          <w:rFonts w:ascii="Calibri" w:cs="Calibri" w:eastAsia="Calibri" w:hAnsi="Calibri"/>
+          <w:b/>
+          <w:bCs/>
+          <w:i w:val="false"/>
+          <w:iCs w:val="false"/>
+          <w:color w:val="0F2A4A"/>
+          <w:sz w:val="22"/>
+          <w:szCs w:val="22"/>
+        </w:rPr>
+        <w:t xml:space="preserve">7.5.2  Exporting Drawings as GPX or KML</w:t>
+      </w:r>
+    </w:p>
+    <w:p>
+      <w:pPr>
+        <w:keepNext w:val="false"/>
+        <w:spacing w:after="80" w:before="80" w:line="276" w:lineRule="auto"/>
+        <w:jc w:val="left"/>
+      </w:pPr>
+      <w:r>
+        <w:rPr>
+          <w:rFonts w:ascii="Calibri" w:cs="Calibri" w:eastAsia="Calibri" w:hAnsi="Calibri"/>
+          <w:b w:val="false"/>
+          <w:bCs w:val="false"/>
+          <w:i w:val="false"/>
+          <w:iCs w:val="false"/>
+          <w:color w:val="1A1A1A"/>
+          <w:sz w:val="22"/>
+          <w:szCs w:val="22"/>
+        </w:rPr>
+        <w:t xml:space="preserve">To export the drawings currently on the map, use File &gt; Map &gt; Export Drawings. Choose GPX or KML format. All lines and polygons are exported. Circles are not exported as neither format has an equivalent geometry type.</w:t>
+      </w:r>
+    </w:p>
+    <w:p>
+      <w:pPr>
+        <w:keepNext w:val="false"/>
+        <w:spacing w:after="80" w:before="80" w:line="276" w:lineRule="auto"/>
+        <w:jc w:val="left"/>
+      </w:pPr>
+      <w:r>
+        <w:rPr>
+          <w:rFonts w:ascii="Calibri" w:cs="Calibri" w:eastAsia="Calibri" w:hAnsi="Calibri"/>
+          <w:b w:val="false"/>
+          <w:bCs w:val="false"/>
+          <w:i w:val="false"/>
+          <w:iCs w:val="false"/>
+          <w:color w:val="1A1A1A"/>
+          <w:sz w:val="22"/>
+          <w:szCs w:val="22"/>
+        </w:rPr>
+        <w:t xml:space="preserve">Exported GPX files can be loaded on Garmin GPS devices, opened in CalTopo, BaseCamp, or any GPX-compatible application. Exported KML files open in Google Earth, CalTopo, or any KML-compatible application.</w:t>
+      </w:r>
+    </w:p>
+    <w:tbl>
+      <w:tblPr>
+        <w:tblW w:type="dxa" w:w="10080"/>
+        <w:tblBorders>
+          <w:top w:val="single" w:color="auto" w:sz="4"/>
+          <w:left w:val="single" w:color="auto" w:sz="4"/>
+          <w:bottom w:val="single" w:color="auto" w:sz="4"/>
+          <w:right w:val="single" w:color="auto" w:sz="4"/>
+          <w:insideH w:val="single" w:color="auto" w:sz="4"/>
+          <w:insideV w:val="single" w:color="auto" w:sz="4"/>
+        </w:tblBorders>
+      </w:tblPr>
+      <w:tblGrid>
+        <w:gridCol w:w="140"/>
+        <w:gridCol w:w="9940"/>
+      </w:tblGrid>
+      <w:tr>
+        <w:tc>
+          <w:tcPr>
+            <w:tcW w:type="dxa" w:w="140"/>
+            <w:tcBorders>
+              <w:top w:val="none"/>
+              <w:left w:val="none"/>
+              <w:bottom w:val="none"/>
+              <w:right w:val="none"/>
+            </w:tcBorders>
+            <w:shd w:fill="1A56A0" w:color="auto" w:val="clear"/>
+          </w:tcPr>
+          <w:p>
+            <w:pPr>
+              <w:keepNext w:val="false"/>
+              <w:spacing w:after="0" w:before="0" w:line="276" w:lineRule="auto"/>
+              <w:jc w:val="left"/>
+            </w:pPr>
+            <w:r>
+              <w:rPr>
+                <w:rFonts w:ascii="Calibri" w:cs="Calibri" w:eastAsia="Calibri" w:hAnsi="Calibri"/>
+                <w:b w:val="false"/>
+                <w:bCs w:val="false"/>
+                <w:i w:val="false"/>
+                <w:iCs w:val="false"/>
+                <w:color w:val="1A1A1A"/>
+                <w:sz w:val="22"/>
+                <w:szCs w:val="22"/>
+              </w:rPr>
+              <w:t xml:space="preserve"/>
+            </w:r>
+          </w:p>
+        </w:tc>
+        <w:tc>
+          <w:tcPr>
+            <w:tcW w:type="dxa" w:w="9940"/>
+            <w:tcBorders>
+              <w:top w:val="none"/>
+              <w:left w:val="none"/>
+              <w:bottom w:val="none"/>
+              <w:right w:val="none"/>
+            </w:tcBorders>
+            <w:shd w:fill="EBF3FB" w:color="auto" w:val="clear"/>
+            <w:tcMar>
+              <w:top w:type="dxa" w:w="120"/>
+              <w:left w:type="dxa" w:w="200"/>
+              <w:bottom w:type="dxa" w:w="120"/>
+              <w:right w:type="dxa" w:w="200"/>
+            </w:tcMar>
+          </w:tcPr>
+          <w:p>
+            <w:pPr>
+              <w:keepNext w:val="false"/>
+              <w:spacing w:after="40" w:before="0" w:line="276" w:lineRule="auto"/>
+              <w:jc w:val="left"/>
+            </w:pPr>
+            <w:r>
+              <w:rPr>
+                <w:rFonts w:ascii="Calibri" w:cs="Calibri" w:eastAsia="Calibri" w:hAnsi="Calibri"/>
+                <w:b/>
+                <w:bCs/>
+                <w:i w:val="false"/>
+                <w:iCs w:val="false"/>
+                <w:color w:val="1A56A0"/>
+                <w:sz w:val="20"/>
+                <w:szCs w:val="20"/>
+              </w:rPr>
+              <w:t xml:space="preserve">💡  Tip</w:t>
+            </w:r>
+          </w:p>
+          <w:p>
+            <w:pPr>
+              <w:keepNext w:val="false"/>
+              <w:spacing w:after="0" w:before="40" w:line="276" w:lineRule="auto"/>
+              <w:jc w:val="left"/>
+            </w:pPr>
+            <w:r>
+              <w:rPr>
+                <w:rFonts w:ascii="Calibri" w:cs="Calibri" w:eastAsia="Calibri" w:hAnsi="Calibri"/>
+                <w:b w:val="false"/>
+                <w:bCs w:val="false"/>
+                <w:i w:val="false"/>
+                <w:iCs w:val="false"/>
+                <w:color w:val="1A1A1A"/>
+                <w:sz w:val="21"/>
+                <w:szCs w:val="21"/>
+              </w:rPr>
+              <w:t xml:space="preserve">For SAR operations: draw your search segments in APRS Command, export as KML, and import into CalTopo to overlay on your probability maps. Or export your CalTopo assignment segments as GPX and import them into APRS Command so field operators can see their segments alongside live APRS positions.</w:t>
+            </w:r>
+          </w:p>
+        </w:tc>
+      </w:tr>
+    </w:tbl>
+    <w:p>
+      <w:pPr>
+        <w:keepNext w:val="false"/>
+        <w:spacing w:after="0" w:before="0" w:line="276" w:lineRule="auto"/>
+        <w:jc w:val="left"/>
+      </w:pPr>
+      <w:r>
+        <w:rPr>
+          <w:rFonts w:ascii="Calibri" w:cs="Calibri" w:eastAsia="Calibri" w:hAnsi="Calibri"/>
+          <w:b w:val="false"/>
+          <w:bCs w:val="false"/>
+          <w:i w:val="false"/>
+          <w:iCs w:val="false"/>
+          <w:color w:val="1A1A1A"/>
+          <w:sz w:val="22"/>
+          <w:szCs w:val="22"/>
+        </w:rPr>
+        <w:t xml:space="preserve"/>
+      </w:r>
+    </w:p>
+    <w:p>
+      <w:pPr>
+        <w:keepNext/>
         <w:pBdr>
           <w:bottom w:val="single" w:color="D0D8E0" w:sz="4"/>
         </w:pBdr>
@@ -20728,26 +21253,7 @@
           <w:sz w:val="24"/>
           <w:szCs w:val="24"/>
         </w:rPr>
-        <w:t xml:space="preserve">7.6  Weather</w:t>
-      </w:r>
-    </w:p>
-    <w:p>
-      <w:pPr>
-        <w:keepNext/>
-        <w:spacing w:after="40" w:before="200"/>
-      </w:pPr>
-      <w:r>
-        <w:rPr>
-          <w:rFonts w:ascii="Calibri" w:cs="Calibri" w:eastAsia="Calibri" w:hAnsi="Calibri"/>
-          <w:b/>
-          <w:bCs/>
-          <w:i w:val="false"/>
-          <w:iCs w:val="false"/>
-          <w:color w:val="0F2A4A"/>
-          <w:sz w:val="22"/>
-          <w:szCs w:val="22"/>
-        </w:rPr>
-        <w:t xml:space="preserve">7.6.1  Weather Stations</w:t>
+        <w:t xml:space="preserve">7.6  CalTopo / SARTopo Integration</w:t>
       </w:r>
     </w:p>
     <w:p>
@@ -20767,7 +21273,7 @@
           <w:sz w:val="22"/>
           <w:szCs w:val="22"/>
         </w:rPr>
-        <w:t xml:space="preserve">Shows weather readings from APRS weather stations in your area — temperature, wind speed and direction, barometric pressure, and rainfall. Click any weather station icon on the map to see its current data.</w:t>
+        <w:t xml:space="preserve">CalTopo (also known as SARTopo) is the mapping platform used by search and rescue teams across North America. APRS Command integrates with CalTopo in two ways: file-based exchange using GPX/KML, and live position forwarding that sends APRS station positions directly to your CalTopo map in real time.</w:t>
       </w:r>
     </w:p>
     <w:p>
@@ -20786,7 +21292,7 @@
           <w:sz w:val="22"/>
           <w:szCs w:val="22"/>
         </w:rPr>
-        <w:t xml:space="preserve">7.6.2  NWS Weather Alerts</w:t>
+        <w:t xml:space="preserve">7.6.1  File-Based Exchange (GPX and KML)</w:t>
       </w:r>
     </w:p>
     <w:p>
@@ -20806,7 +21312,7 @@
           <w:sz w:val="22"/>
           <w:szCs w:val="22"/>
         </w:rPr>
-        <w:t xml:space="preserve">Displays active National Weather Service alerts for your area — tornado warnings, severe thunderstorm warnings, winter storm advisories. A badge on the alert icon shows the count of active alerts. Alerts are color-coded by severity: deep red for Extreme, red for Severe, orange for Moderate, yellow for Minor.</w:t>
+        <w:t xml:space="preserve">This workflow requires no configuration and works with a free CalTopo account.</w:t>
       </w:r>
     </w:p>
     <w:p>
@@ -20825,7 +21331,103 @@
           <w:sz w:val="22"/>
           <w:szCs w:val="22"/>
         </w:rPr>
-        <w:t xml:space="preserve">7.6.3  Radar Overlay</w:t>
+        <w:t xml:space="preserve">CalTopo → APRS Command</w:t>
+      </w:r>
+    </w:p>
+    <w:p>
+      <w:pPr>
+        <w:spacing w:after="60" w:before="60"/>
+        <w:ind w:left="720" w:hanging="360"/>
+      </w:pPr>
+      <w:r>
+        <w:rPr>
+          <w:rFonts w:ascii="Calibri" w:cs="Calibri" w:eastAsia="Calibri" w:hAnsi="Calibri"/>
+          <w:b/>
+          <w:bCs/>
+          <w:i w:val="false"/>
+          <w:iCs w:val="false"/>
+          <w:color w:val="1A56A0"/>
+          <w:sz w:val="22"/>
+          <w:szCs w:val="22"/>
+        </w:rPr>
+        <w:t xml:space="preserve">1.  </w:t>
+      </w:r>
+      <w:r>
+        <w:rPr>
+          <w:rFonts w:ascii="Calibri" w:cs="Calibri" w:eastAsia="Calibri" w:hAnsi="Calibri"/>
+          <w:b w:val="false"/>
+          <w:bCs w:val="false"/>
+          <w:i w:val="false"/>
+          <w:iCs w:val="false"/>
+          <w:color w:val="1A1A1A"/>
+          <w:sz w:val="22"/>
+          <w:szCs w:val="22"/>
+        </w:rPr>
+        <w:t xml:space="preserve">In CalTopo, open your SAR map and click Export at the top of the Map Objects panel.</w:t>
+      </w:r>
+    </w:p>
+    <w:p>
+      <w:pPr>
+        <w:spacing w:after="60" w:before="60"/>
+        <w:ind w:left="720" w:hanging="360"/>
+      </w:pPr>
+      <w:r>
+        <w:rPr>
+          <w:rFonts w:ascii="Calibri" w:cs="Calibri" w:eastAsia="Calibri" w:hAnsi="Calibri"/>
+          <w:b/>
+          <w:bCs/>
+          <w:i w:val="false"/>
+          <w:iCs w:val="false"/>
+          <w:color w:val="1A56A0"/>
+          <w:sz w:val="22"/>
+          <w:szCs w:val="22"/>
+        </w:rPr>
+        <w:t xml:space="preserve">2.  </w:t>
+      </w:r>
+      <w:r>
+        <w:rPr>
+          <w:rFonts w:ascii="Calibri" w:cs="Calibri" w:eastAsia="Calibri" w:hAnsi="Calibri"/>
+          <w:b w:val="false"/>
+          <w:bCs w:val="false"/>
+          <w:i w:val="false"/>
+          <w:iCs w:val="false"/>
+          <w:color w:val="1A1A1A"/>
+          <w:sz w:val="22"/>
+          <w:szCs w:val="22"/>
+        </w:rPr>
+        <w:t xml:space="preserve">Choose Download GPX File or Download KML File.</w:t>
+      </w:r>
+    </w:p>
+    <w:p>
+      <w:pPr>
+        <w:spacing w:after="60" w:before="60"/>
+        <w:ind w:left="720" w:hanging="360"/>
+      </w:pPr>
+      <w:r>
+        <w:rPr>
+          <w:rFonts w:ascii="Calibri" w:cs="Calibri" w:eastAsia="Calibri" w:hAnsi="Calibri"/>
+          <w:b/>
+          <w:bCs/>
+          <w:i w:val="false"/>
+          <w:iCs w:val="false"/>
+          <w:color w:val="1A56A0"/>
+          <w:sz w:val="22"/>
+          <w:szCs w:val="22"/>
+        </w:rPr>
+        <w:t xml:space="preserve">3.  </w:t>
+      </w:r>
+      <w:r>
+        <w:rPr>
+          <w:rFonts w:ascii="Calibri" w:cs="Calibri" w:eastAsia="Calibri" w:hAnsi="Calibri"/>
+          <w:b w:val="false"/>
+          <w:bCs w:val="false"/>
+          <w:i w:val="false"/>
+          <w:iCs w:val="false"/>
+          <w:color w:val="1A1A1A"/>
+          <w:sz w:val="22"/>
+          <w:szCs w:val="22"/>
+        </w:rPr>
+        <w:t xml:space="preserve">In APRS Command, use File &gt; Map &gt; Import GPX/KML and select the downloaded file.</w:t>
       </w:r>
     </w:p>
     <w:p>
@@ -20845,7 +21447,27 @@
           <w:sz w:val="22"/>
           <w:szCs w:val="22"/>
         </w:rPr>
-        <w:t xml:space="preserve">See Section 6.10. Available from both the sidebar and Weather &gt; Radar Overlay: ON/OFF.</w:t>
+        <w:t xml:space="preserve">Your CalTopo assignment segments, clue locations, and search area boundaries now appear as overlays on the APRS map alongside the live positions of field operators. SAR coordinators get APRS situational awareness without leaving their CalTopo workflow.</w:t>
+      </w:r>
+    </w:p>
+    <w:p>
+      <w:pPr>
+        <w:keepNext w:val="false"/>
+        <w:spacing w:after="0" w:before="0" w:line="276" w:lineRule="auto"/>
+        <w:jc w:val="left"/>
+      </w:pPr>
+      <w:r>
+        <w:rPr>
+          <w:rFonts w:ascii="Calibri" w:cs="Calibri" w:eastAsia="Calibri" w:hAnsi="Calibri"/>
+          <w:b w:val="false"/>
+          <w:bCs w:val="false"/>
+          <w:i w:val="false"/>
+          <w:iCs w:val="false"/>
+          <w:color w:val="1A1A1A"/>
+          <w:sz w:val="22"/>
+          <w:szCs w:val="22"/>
+        </w:rPr>
+        <w:t xml:space="preserve"/>
       </w:r>
     </w:p>
     <w:p>
@@ -20864,7 +21486,103 @@
           <w:sz w:val="22"/>
           <w:szCs w:val="22"/>
         </w:rPr>
-        <w:t xml:space="preserve">7.6.4  Weather History</w:t>
+        <w:t xml:space="preserve">APRS Command → CalTopo</w:t>
+      </w:r>
+    </w:p>
+    <w:p>
+      <w:pPr>
+        <w:spacing w:after="60" w:before="60"/>
+        <w:ind w:left="720" w:hanging="360"/>
+      </w:pPr>
+      <w:r>
+        <w:rPr>
+          <w:rFonts w:ascii="Calibri" w:cs="Calibri" w:eastAsia="Calibri" w:hAnsi="Calibri"/>
+          <w:b/>
+          <w:bCs/>
+          <w:i w:val="false"/>
+          <w:iCs w:val="false"/>
+          <w:color w:val="1A56A0"/>
+          <w:sz w:val="22"/>
+          <w:szCs w:val="22"/>
+        </w:rPr>
+        <w:t xml:space="preserve">1.  </w:t>
+      </w:r>
+      <w:r>
+        <w:rPr>
+          <w:rFonts w:ascii="Calibri" w:cs="Calibri" w:eastAsia="Calibri" w:hAnsi="Calibri"/>
+          <w:b w:val="false"/>
+          <w:bCs w:val="false"/>
+          <w:i w:val="false"/>
+          <w:iCs w:val="false"/>
+          <w:color w:val="1A1A1A"/>
+          <w:sz w:val="22"/>
+          <w:szCs w:val="22"/>
+        </w:rPr>
+        <w:t xml:space="preserve">In APRS Command, draw your search segments or planned routes using the Draw Line and Draw Polygon tools.</w:t>
+      </w:r>
+    </w:p>
+    <w:p>
+      <w:pPr>
+        <w:spacing w:after="60" w:before="60"/>
+        <w:ind w:left="720" w:hanging="360"/>
+      </w:pPr>
+      <w:r>
+        <w:rPr>
+          <w:rFonts w:ascii="Calibri" w:cs="Calibri" w:eastAsia="Calibri" w:hAnsi="Calibri"/>
+          <w:b/>
+          <w:bCs/>
+          <w:i w:val="false"/>
+          <w:iCs w:val="false"/>
+          <w:color w:val="1A56A0"/>
+          <w:sz w:val="22"/>
+          <w:szCs w:val="22"/>
+        </w:rPr>
+        <w:t xml:space="preserve">2.  </w:t>
+      </w:r>
+      <w:r>
+        <w:rPr>
+          <w:rFonts w:ascii="Calibri" w:cs="Calibri" w:eastAsia="Calibri" w:hAnsi="Calibri"/>
+          <w:b w:val="false"/>
+          <w:bCs w:val="false"/>
+          <w:i w:val="false"/>
+          <w:iCs w:val="false"/>
+          <w:color w:val="1A1A1A"/>
+          <w:sz w:val="22"/>
+          <w:szCs w:val="22"/>
+        </w:rPr>
+        <w:t xml:space="preserve">Use File &gt; Map &gt; Export Drawings and choose KML format.</w:t>
+      </w:r>
+    </w:p>
+    <w:p>
+      <w:pPr>
+        <w:spacing w:after="60" w:before="60"/>
+        <w:ind w:left="720" w:hanging="360"/>
+      </w:pPr>
+      <w:r>
+        <w:rPr>
+          <w:rFonts w:ascii="Calibri" w:cs="Calibri" w:eastAsia="Calibri" w:hAnsi="Calibri"/>
+          <w:b/>
+          <w:bCs/>
+          <w:i w:val="false"/>
+          <w:iCs w:val="false"/>
+          <w:color w:val="1A56A0"/>
+          <w:sz w:val="22"/>
+          <w:szCs w:val="22"/>
+        </w:rPr>
+        <w:t xml:space="preserve">3.  </w:t>
+      </w:r>
+      <w:r>
+        <w:rPr>
+          <w:rFonts w:ascii="Calibri" w:cs="Calibri" w:eastAsia="Calibri" w:hAnsi="Calibri"/>
+          <w:b w:val="false"/>
+          <w:bCs w:val="false"/>
+          <w:i w:val="false"/>
+          <w:iCs w:val="false"/>
+          <w:color w:val="1A1A1A"/>
+          <w:sz w:val="22"/>
+          <w:szCs w:val="22"/>
+        </w:rPr>
+        <w:t xml:space="preserve">In CalTopo, click Import in the Map Objects panel and select your KML file.</w:t>
       </w:r>
     </w:p>
     <w:p>
@@ -20884,7 +21602,214 @@
           <w:sz w:val="22"/>
           <w:szCs w:val="22"/>
         </w:rPr>
-        <w:t xml:space="preserve">The Weather window includes a History tab showing a rolling chart of temperature, humidity, and wind speed from a selected weather station. APRS Command stores up to 144 readings per station (24 hours at 10-minute intervals). History accumulates while APRS Command is running and is not saved between sessions.</w:t>
+        <w:t xml:space="preserve">Alternatively, use this workflow after a search to import tracked field operator routes. Select operator tracks from the Packet Log, export as GPX, and import into CalTopo for post-mission probability analysis and ICS documentation.</w:t>
+      </w:r>
+    </w:p>
+    <w:p>
+      <w:pPr>
+        <w:keepNext w:val="false"/>
+        <w:spacing w:after="0" w:before="0" w:line="276" w:lineRule="auto"/>
+        <w:jc w:val="left"/>
+      </w:pPr>
+      <w:r>
+        <w:rPr>
+          <w:rFonts w:ascii="Calibri" w:cs="Calibri" w:eastAsia="Calibri" w:hAnsi="Calibri"/>
+          <w:b w:val="false"/>
+          <w:bCs w:val="false"/>
+          <w:i w:val="false"/>
+          <w:iCs w:val="false"/>
+          <w:color w:val="1A1A1A"/>
+          <w:sz w:val="22"/>
+          <w:szCs w:val="22"/>
+        </w:rPr>
+        <w:t xml:space="preserve"/>
+      </w:r>
+    </w:p>
+    <w:p>
+      <w:pPr>
+        <w:keepNext/>
+        <w:spacing w:after="40" w:before="200"/>
+      </w:pPr>
+      <w:r>
+        <w:rPr>
+          <w:rFonts w:ascii="Calibri" w:cs="Calibri" w:eastAsia="Calibri" w:hAnsi="Calibri"/>
+          <w:b/>
+          <w:bCs/>
+          <w:i w:val="false"/>
+          <w:iCs w:val="false"/>
+          <w:color w:val="0F2A4A"/>
+          <w:sz w:val="22"/>
+          <w:szCs w:val="22"/>
+        </w:rPr>
+        <w:t xml:space="preserve">7.6.2  Live Position Forwarding</w:t>
+      </w:r>
+    </w:p>
+    <w:p>
+      <w:pPr>
+        <w:keepNext w:val="false"/>
+        <w:spacing w:after="80" w:before="80" w:line="276" w:lineRule="auto"/>
+        <w:jc w:val="left"/>
+      </w:pPr>
+      <w:r>
+        <w:rPr>
+          <w:rFonts w:ascii="Calibri" w:cs="Calibri" w:eastAsia="Calibri" w:hAnsi="Calibri"/>
+          <w:b w:val="false"/>
+          <w:bCs w:val="false"/>
+          <w:i w:val="false"/>
+          <w:iCs w:val="false"/>
+          <w:color w:val="1A1A1A"/>
+          <w:sz w:val="22"/>
+          <w:szCs w:val="22"/>
+        </w:rPr>
+        <w:t xml:space="preserve">When live forwarding is enabled, APRS Command automatically sends every received station position to your CalTopo map as it arrives. SAR coordinators watching CalTopo see APRS-tracked field operator positions updating in real time, overlaid on their assignment segments — without any manual export/import step.</w:t>
+      </w:r>
+    </w:p>
+    <w:tbl>
+      <w:tblPr>
+        <w:tblW w:type="dxa" w:w="10080"/>
+        <w:tblBorders>
+          <w:top w:val="single" w:color="auto" w:sz="4"/>
+          <w:left w:val="single" w:color="auto" w:sz="4"/>
+          <w:bottom w:val="single" w:color="auto" w:sz="4"/>
+          <w:right w:val="single" w:color="auto" w:sz="4"/>
+          <w:insideH w:val="single" w:color="auto" w:sz="4"/>
+          <w:insideV w:val="single" w:color="auto" w:sz="4"/>
+        </w:tblBorders>
+      </w:tblPr>
+      <w:tblGrid>
+        <w:gridCol w:w="140"/>
+        <w:gridCol w:w="9940"/>
+      </w:tblGrid>
+      <w:tr>
+        <w:tc>
+          <w:tcPr>
+            <w:tcW w:type="dxa" w:w="140"/>
+            <w:tcBorders>
+              <w:top w:val="none"/>
+              <w:left w:val="none"/>
+              <w:bottom w:val="none"/>
+              <w:right w:val="none"/>
+            </w:tcBorders>
+            <w:shd w:fill="C0392B" w:color="auto" w:val="clear"/>
+          </w:tcPr>
+          <w:p>
+            <w:pPr>
+              <w:keepNext w:val="false"/>
+              <w:spacing w:after="0" w:before="0" w:line="276" w:lineRule="auto"/>
+              <w:jc w:val="left"/>
+            </w:pPr>
+            <w:r>
+              <w:rPr>
+                <w:rFonts w:ascii="Calibri" w:cs="Calibri" w:eastAsia="Calibri" w:hAnsi="Calibri"/>
+                <w:b w:val="false"/>
+                <w:bCs w:val="false"/>
+                <w:i w:val="false"/>
+                <w:iCs w:val="false"/>
+                <w:color w:val="1A1A1A"/>
+                <w:sz w:val="22"/>
+                <w:szCs w:val="22"/>
+              </w:rPr>
+              <w:t xml:space="preserve"/>
+            </w:r>
+          </w:p>
+        </w:tc>
+        <w:tc>
+          <w:tcPr>
+            <w:tcW w:type="dxa" w:w="9940"/>
+            <w:tcBorders>
+              <w:top w:val="none"/>
+              <w:left w:val="none"/>
+              <w:bottom w:val="none"/>
+              <w:right w:val="none"/>
+            </w:tcBorders>
+            <w:shd w:fill="FFF1F0" w:color="auto" w:val="clear"/>
+            <w:tcMar>
+              <w:top w:type="dxa" w:w="120"/>
+              <w:left w:type="dxa" w:w="200"/>
+              <w:bottom w:type="dxa" w:w="120"/>
+              <w:right w:type="dxa" w:w="200"/>
+            </w:tcMar>
+          </w:tcPr>
+          <w:p>
+            <w:pPr>
+              <w:keepNext w:val="false"/>
+              <w:spacing w:after="40" w:before="0" w:line="276" w:lineRule="auto"/>
+              <w:jc w:val="left"/>
+            </w:pPr>
+            <w:r>
+              <w:rPr>
+                <w:rFonts w:ascii="Calibri" w:cs="Calibri" w:eastAsia="Calibri" w:hAnsi="Calibri"/>
+                <w:b/>
+                <w:bCs/>
+                <w:i w:val="false"/>
+                <w:iCs w:val="false"/>
+                <w:color w:val="C0392B"/>
+                <w:sz w:val="20"/>
+                <w:szCs w:val="20"/>
+              </w:rPr>
+              <w:t xml:space="preserve">🔴  Important</w:t>
+            </w:r>
+          </w:p>
+          <w:p>
+            <w:pPr>
+              <w:keepNext w:val="false"/>
+              <w:spacing w:after="0" w:before="40" w:line="276" w:lineRule="auto"/>
+              <w:jc w:val="left"/>
+            </w:pPr>
+            <w:r>
+              <w:rPr>
+                <w:rFonts w:ascii="Calibri" w:cs="Calibri" w:eastAsia="Calibri" w:hAnsi="Calibri"/>
+                <w:b w:val="false"/>
+                <w:bCs w:val="false"/>
+                <w:i w:val="false"/>
+                <w:iCs w:val="false"/>
+                <w:color w:val="1A1A1A"/>
+                <w:sz w:val="21"/>
+                <w:szCs w:val="21"/>
+              </w:rPr>
+              <w:t xml:space="preserve">Live forwarding requires internet access. This feature is suitable for command post operations with a network connection. For fully offline field deployments, use the file-based exchange workflow described above.</w:t>
+            </w:r>
+          </w:p>
+        </w:tc>
+      </w:tr>
+    </w:tbl>
+    <w:p>
+      <w:pPr>
+        <w:keepNext w:val="false"/>
+        <w:spacing w:after="0" w:before="0" w:line="276" w:lineRule="auto"/>
+        <w:jc w:val="left"/>
+      </w:pPr>
+      <w:r>
+        <w:rPr>
+          <w:rFonts w:ascii="Calibri" w:cs="Calibri" w:eastAsia="Calibri" w:hAnsi="Calibri"/>
+          <w:b w:val="false"/>
+          <w:bCs w:val="false"/>
+          <w:i w:val="false"/>
+          <w:iCs w:val="false"/>
+          <w:color w:val="1A1A1A"/>
+          <w:sz w:val="22"/>
+          <w:szCs w:val="22"/>
+        </w:rPr>
+        <w:t xml:space="preserve"/>
+      </w:r>
+    </w:p>
+    <w:p>
+      <w:pPr>
+        <w:keepNext/>
+        <w:spacing w:after="40" w:before="200"/>
+      </w:pPr>
+      <w:r>
+        <w:rPr>
+          <w:rFonts w:ascii="Calibri" w:cs="Calibri" w:eastAsia="Calibri" w:hAnsi="Calibri"/>
+          <w:b/>
+          <w:bCs/>
+          <w:i w:val="false"/>
+          <w:iCs w:val="false"/>
+          <w:color w:val="0F2A4A"/>
+          <w:sz w:val="22"/>
+          <w:szCs w:val="22"/>
+        </w:rPr>
+        <w:t xml:space="preserve">Setting up CalTopo for Live Forwarding</w:t>
       </w:r>
     </w:p>
     <w:p>
@@ -20916,7 +21841,7 @@
           <w:sz w:val="22"/>
           <w:szCs w:val="22"/>
         </w:rPr>
-        <w:t xml:space="preserve">Open the Weather window from the menu bar.</w:t>
+        <w:t xml:space="preserve">Open your CalTopo map at caltopo.com.</w:t>
       </w:r>
     </w:p>
     <w:p>
@@ -20948,7 +21873,7 @@
           <w:sz w:val="22"/>
           <w:szCs w:val="22"/>
         </w:rPr>
-        <w:t xml:space="preserve">Click the History tab.</w:t>
+        <w:t xml:space="preserve">Click + Add in the Map Objects panel.</w:t>
       </w:r>
     </w:p>
     <w:p>
@@ -20980,7 +21905,7 @@
           <w:sz w:val="22"/>
           <w:szCs w:val="22"/>
         </w:rPr>
-        <w:t xml:space="preserve">Select a station from the dropdown.</w:t>
+        <w:t xml:space="preserve">Select Locator, then Live Track — Fleet, Email, Other.</w:t>
       </w:r>
     </w:p>
     <w:p>
@@ -21012,7 +21937,59 @@
           <w:sz w:val="22"/>
           <w:szCs w:val="22"/>
         </w:rPr>
-        <w:t xml:space="preserve">Charts appear for temperature (°F), humidity (%), and wind speed (mph).</w:t>
+        <w:t xml:space="preserve">Give the locator a name (e.g. "APRS Command Feed") and click Add.</w:t>
+      </w:r>
+    </w:p>
+    <w:p>
+      <w:pPr>
+        <w:spacing w:after="60" w:before="60"/>
+        <w:ind w:left="720" w:hanging="360"/>
+      </w:pPr>
+      <w:r>
+        <w:rPr>
+          <w:rFonts w:ascii="Calibri" w:cs="Calibri" w:eastAsia="Calibri" w:hAnsi="Calibri"/>
+          <w:b/>
+          <w:bCs/>
+          <w:i w:val="false"/>
+          <w:iCs w:val="false"/>
+          <w:color w:val="1A56A0"/>
+          <w:sz w:val="22"/>
+          <w:szCs w:val="22"/>
+        </w:rPr>
+        <w:t xml:space="preserve">5.  </w:t>
+      </w:r>
+      <w:r>
+        <w:rPr>
+          <w:rFonts w:ascii="Calibri" w:cs="Calibri" w:eastAsia="Calibri" w:hAnsi="Calibri"/>
+          <w:b w:val="false"/>
+          <w:bCs w:val="false"/>
+          <w:i w:val="false"/>
+          <w:iCs w:val="false"/>
+          <w:color w:val="1A1A1A"/>
+          <w:sz w:val="22"/>
+          <w:szCs w:val="22"/>
+        </w:rPr>
+        <w:t xml:space="preserve">Note the Map ID from the URL in your browser — it is the 4–6 character code after /m/ (example: caltopo.com/m/AB12 → Map ID is AB12).</w:t>
+      </w:r>
+    </w:p>
+    <w:p>
+      <w:pPr>
+        <w:keepNext w:val="false"/>
+        <w:spacing w:after="0" w:before="0" w:line="276" w:lineRule="auto"/>
+        <w:jc w:val="left"/>
+      </w:pPr>
+      <w:r>
+        <w:rPr>
+          <w:rFonts w:ascii="Calibri" w:cs="Calibri" w:eastAsia="Calibri" w:hAnsi="Calibri"/>
+          <w:b w:val="false"/>
+          <w:bCs w:val="false"/>
+          <w:i w:val="false"/>
+          <w:iCs w:val="false"/>
+          <w:color w:val="1A1A1A"/>
+          <w:sz w:val="22"/>
+          <w:szCs w:val="22"/>
+        </w:rPr>
+        <w:t xml:space="preserve"/>
       </w:r>
     </w:p>
     <w:p>
@@ -21031,7 +22008,768 @@
           <w:sz w:val="22"/>
           <w:szCs w:val="22"/>
         </w:rPr>
-        <w:t xml:space="preserve">7.6.5  Connecting a Home Weather Station</w:t>
+        <w:t xml:space="preserve">Configuring APRS Command</w:t>
+      </w:r>
+    </w:p>
+    <w:p>
+      <w:pPr>
+        <w:spacing w:after="60" w:before="60"/>
+        <w:ind w:left="720" w:hanging="360"/>
+      </w:pPr>
+      <w:r>
+        <w:rPr>
+          <w:rFonts w:ascii="Calibri" w:cs="Calibri" w:eastAsia="Calibri" w:hAnsi="Calibri"/>
+          <w:b/>
+          <w:bCs/>
+          <w:i w:val="false"/>
+          <w:iCs w:val="false"/>
+          <w:color w:val="1A56A0"/>
+          <w:sz w:val="22"/>
+          <w:szCs w:val="22"/>
+        </w:rPr>
+        <w:t xml:space="preserve">1.  </w:t>
+      </w:r>
+      <w:r>
+        <w:rPr>
+          <w:rFonts w:ascii="Calibri" w:cs="Calibri" w:eastAsia="Calibri" w:hAnsi="Calibri"/>
+          <w:b w:val="false"/>
+          <w:bCs w:val="false"/>
+          <w:i w:val="false"/>
+          <w:iCs w:val="false"/>
+          <w:color w:val="1A1A1A"/>
+          <w:sz w:val="22"/>
+          <w:szCs w:val="22"/>
+        </w:rPr>
+        <w:t xml:space="preserve">Open Settings &gt; Integrations &gt; CalTopo.</w:t>
+      </w:r>
+    </w:p>
+    <w:p>
+      <w:pPr>
+        <w:spacing w:after="60" w:before="60"/>
+        <w:ind w:left="720" w:hanging="360"/>
+      </w:pPr>
+      <w:r>
+        <w:rPr>
+          <w:rFonts w:ascii="Calibri" w:cs="Calibri" w:eastAsia="Calibri" w:hAnsi="Calibri"/>
+          <w:b/>
+          <w:bCs/>
+          <w:i w:val="false"/>
+          <w:iCs w:val="false"/>
+          <w:color w:val="1A56A0"/>
+          <w:sz w:val="22"/>
+          <w:szCs w:val="22"/>
+        </w:rPr>
+        <w:t xml:space="preserve">2.  </w:t>
+      </w:r>
+      <w:r>
+        <w:rPr>
+          <w:rFonts w:ascii="Calibri" w:cs="Calibri" w:eastAsia="Calibri" w:hAnsi="Calibri"/>
+          <w:b w:val="false"/>
+          <w:bCs w:val="false"/>
+          <w:i w:val="false"/>
+          <w:iCs w:val="false"/>
+          <w:color w:val="1A1A1A"/>
+          <w:sz w:val="22"/>
+          <w:szCs w:val="22"/>
+        </w:rPr>
+        <w:t xml:space="preserve">Enter the Map ID you noted above.</w:t>
+      </w:r>
+    </w:p>
+    <w:p>
+      <w:pPr>
+        <w:spacing w:after="60" w:before="60"/>
+        <w:ind w:left="720" w:hanging="360"/>
+      </w:pPr>
+      <w:r>
+        <w:rPr>
+          <w:rFonts w:ascii="Calibri" w:cs="Calibri" w:eastAsia="Calibri" w:hAnsi="Calibri"/>
+          <w:b/>
+          <w:bCs/>
+          <w:i w:val="false"/>
+          <w:iCs w:val="false"/>
+          <w:color w:val="1A56A0"/>
+          <w:sz w:val="22"/>
+          <w:szCs w:val="22"/>
+        </w:rPr>
+        <w:t xml:space="preserve">3.  </w:t>
+      </w:r>
+      <w:r>
+        <w:rPr>
+          <w:rFonts w:ascii="Calibri" w:cs="Calibri" w:eastAsia="Calibri" w:hAnsi="Calibri"/>
+          <w:b w:val="false"/>
+          <w:bCs w:val="false"/>
+          <w:i w:val="false"/>
+          <w:iCs w:val="false"/>
+          <w:color w:val="1A1A1A"/>
+          <w:sz w:val="22"/>
+          <w:szCs w:val="22"/>
+        </w:rPr>
+        <w:t xml:space="preserve">Choose which sources to forward — APRS-IS packets, RF packets, or both.</w:t>
+      </w:r>
+    </w:p>
+    <w:p>
+      <w:pPr>
+        <w:spacing w:after="60" w:before="60"/>
+        <w:ind w:left="720" w:hanging="360"/>
+      </w:pPr>
+      <w:r>
+        <w:rPr>
+          <w:rFonts w:ascii="Calibri" w:cs="Calibri" w:eastAsia="Calibri" w:hAnsi="Calibri"/>
+          <w:b/>
+          <w:bCs/>
+          <w:i w:val="false"/>
+          <w:iCs w:val="false"/>
+          <w:color w:val="1A56A0"/>
+          <w:sz w:val="22"/>
+          <w:szCs w:val="22"/>
+        </w:rPr>
+        <w:t xml:space="preserve">4.  </w:t>
+      </w:r>
+      <w:r>
+        <w:rPr>
+          <w:rFonts w:ascii="Calibri" w:cs="Calibri" w:eastAsia="Calibri" w:hAnsi="Calibri"/>
+          <w:b w:val="false"/>
+          <w:bCs w:val="false"/>
+          <w:i w:val="false"/>
+          <w:iCs w:val="false"/>
+          <w:color w:val="1A1A1A"/>
+          <w:sz w:val="22"/>
+          <w:szCs w:val="22"/>
+        </w:rPr>
+        <w:t xml:space="preserve">Set the minimum update interval. The default is 60 seconds — each individual station is forwarded at most once per minute. Lower values increase CalTopo update frequency but generate more network traffic.</w:t>
+      </w:r>
+    </w:p>
+    <w:p>
+      <w:pPr>
+        <w:spacing w:after="60" w:before="60"/>
+        <w:ind w:left="720" w:hanging="360"/>
+      </w:pPr>
+      <w:r>
+        <w:rPr>
+          <w:rFonts w:ascii="Calibri" w:cs="Calibri" w:eastAsia="Calibri" w:hAnsi="Calibri"/>
+          <w:b/>
+          <w:bCs/>
+          <w:i w:val="false"/>
+          <w:iCs w:val="false"/>
+          <w:color w:val="1A56A0"/>
+          <w:sz w:val="22"/>
+          <w:szCs w:val="22"/>
+        </w:rPr>
+        <w:t xml:space="preserve">5.  </w:t>
+      </w:r>
+      <w:r>
+        <w:rPr>
+          <w:rFonts w:ascii="Calibri" w:cs="Calibri" w:eastAsia="Calibri" w:hAnsi="Calibri"/>
+          <w:b w:val="false"/>
+          <w:bCs w:val="false"/>
+          <w:i w:val="false"/>
+          <w:iCs w:val="false"/>
+          <w:color w:val="1A1A1A"/>
+          <w:sz w:val="22"/>
+          <w:szCs w:val="22"/>
+        </w:rPr>
+        <w:t xml:space="preserve">Enable the toggle and click Save.</w:t>
+      </w:r>
+    </w:p>
+    <w:p>
+      <w:pPr>
+        <w:keepNext w:val="false"/>
+        <w:spacing w:after="0" w:before="0" w:line="276" w:lineRule="auto"/>
+        <w:jc w:val="left"/>
+      </w:pPr>
+      <w:r>
+        <w:rPr>
+          <w:rFonts w:ascii="Calibri" w:cs="Calibri" w:eastAsia="Calibri" w:hAnsi="Calibri"/>
+          <w:b w:val="false"/>
+          <w:bCs w:val="false"/>
+          <w:i w:val="false"/>
+          <w:iCs w:val="false"/>
+          <w:color w:val="1A1A1A"/>
+          <w:sz w:val="22"/>
+          <w:szCs w:val="22"/>
+        </w:rPr>
+        <w:t xml:space="preserve"/>
+      </w:r>
+    </w:p>
+    <w:p>
+      <w:pPr>
+        <w:keepNext w:val="false"/>
+        <w:spacing w:after="80" w:before="80" w:line="276" w:lineRule="auto"/>
+        <w:jc w:val="left"/>
+      </w:pPr>
+      <w:r>
+        <w:rPr>
+          <w:rFonts w:ascii="Calibri" w:cs="Calibri" w:eastAsia="Calibri" w:hAnsi="Calibri"/>
+          <w:b w:val="false"/>
+          <w:bCs w:val="false"/>
+          <w:i w:val="false"/>
+          <w:iCs w:val="false"/>
+          <w:color w:val="1A1A1A"/>
+          <w:sz w:val="22"/>
+          <w:szCs w:val="22"/>
+        </w:rPr>
+        <w:t xml:space="preserve">Once enabled, every position packet received by APRS Command — from any station, on any connected source — is forwarded to your CalTopo map. The operator callsign becomes the pin label on the CalTopo map. Multiple field operators appear as separate labeled pins.</w:t>
+      </w:r>
+    </w:p>
+    <w:tbl>
+      <w:tblPr>
+        <w:tblW w:type="dxa" w:w="10080"/>
+        <w:tblBorders>
+          <w:top w:val="single" w:color="auto" w:sz="4"/>
+          <w:left w:val="single" w:color="auto" w:sz="4"/>
+          <w:bottom w:val="single" w:color="auto" w:sz="4"/>
+          <w:right w:val="single" w:color="auto" w:sz="4"/>
+          <w:insideH w:val="single" w:color="auto" w:sz="4"/>
+          <w:insideV w:val="single" w:color="auto" w:sz="4"/>
+        </w:tblBorders>
+      </w:tblPr>
+      <w:tblGrid>
+        <w:gridCol w:w="140"/>
+        <w:gridCol w:w="9940"/>
+      </w:tblGrid>
+      <w:tr>
+        <w:tc>
+          <w:tcPr>
+            <w:tcW w:type="dxa" w:w="140"/>
+            <w:tcBorders>
+              <w:top w:val="none"/>
+              <w:left w:val="none"/>
+              <w:bottom w:val="none"/>
+              <w:right w:val="none"/>
+            </w:tcBorders>
+            <w:shd w:fill="6B7E91" w:color="auto" w:val="clear"/>
+          </w:tcPr>
+          <w:p>
+            <w:pPr>
+              <w:keepNext w:val="false"/>
+              <w:spacing w:after="0" w:before="0" w:line="276" w:lineRule="auto"/>
+              <w:jc w:val="left"/>
+            </w:pPr>
+            <w:r>
+              <w:rPr>
+                <w:rFonts w:ascii="Calibri" w:cs="Calibri" w:eastAsia="Calibri" w:hAnsi="Calibri"/>
+                <w:b w:val="false"/>
+                <w:bCs w:val="false"/>
+                <w:i w:val="false"/>
+                <w:iCs w:val="false"/>
+                <w:color w:val="1A1A1A"/>
+                <w:sz w:val="22"/>
+                <w:szCs w:val="22"/>
+              </w:rPr>
+              <w:t xml:space="preserve"/>
+            </w:r>
+          </w:p>
+        </w:tc>
+        <w:tc>
+          <w:tcPr>
+            <w:tcW w:type="dxa" w:w="9940"/>
+            <w:tcBorders>
+              <w:top w:val="none"/>
+              <w:left w:val="none"/>
+              <w:bottom w:val="none"/>
+              <w:right w:val="none"/>
+            </w:tcBorders>
+            <w:shd w:fill="F0F4F8" w:color="auto" w:val="clear"/>
+            <w:tcMar>
+              <w:top w:type="dxa" w:w="120"/>
+              <w:left w:type="dxa" w:w="200"/>
+              <w:bottom w:type="dxa" w:w="120"/>
+              <w:right w:type="dxa" w:w="200"/>
+            </w:tcMar>
+          </w:tcPr>
+          <w:p>
+            <w:pPr>
+              <w:keepNext w:val="false"/>
+              <w:spacing w:after="40" w:before="0" w:line="276" w:lineRule="auto"/>
+              <w:jc w:val="left"/>
+            </w:pPr>
+            <w:r>
+              <w:rPr>
+                <w:rFonts w:ascii="Calibri" w:cs="Calibri" w:eastAsia="Calibri" w:hAnsi="Calibri"/>
+                <w:b/>
+                <w:bCs/>
+                <w:i w:val="false"/>
+                <w:iCs w:val="false"/>
+                <w:color w:val="6B7E91"/>
+                <w:sz w:val="20"/>
+                <w:szCs w:val="20"/>
+              </w:rPr>
+              <w:t xml:space="preserve">📝  Note</w:t>
+            </w:r>
+          </w:p>
+          <w:p>
+            <w:pPr>
+              <w:keepNext w:val="false"/>
+              <w:spacing w:after="0" w:before="40" w:line="276" w:lineRule="auto"/>
+              <w:jc w:val="left"/>
+            </w:pPr>
+            <w:r>
+              <w:rPr>
+                <w:rFonts w:ascii="Calibri" w:cs="Calibri" w:eastAsia="Calibri" w:hAnsi="Calibri"/>
+                <w:b w:val="false"/>
+                <w:bCs w:val="false"/>
+                <w:i w:val="false"/>
+                <w:iCs w:val="false"/>
+                <w:color w:val="1A1A1A"/>
+                <w:sz w:val="21"/>
+                <w:szCs w:val="21"/>
+              </w:rPr>
+              <w:t xml:space="preserve">No CalTopo account, API key, or authentication is required for live forwarding. The position reporting endpoint is publicly available. The only requirement is the Map ID of a CalTopo map that has a Locator object added to it.</w:t>
+            </w:r>
+          </w:p>
+        </w:tc>
+      </w:tr>
+    </w:tbl>
+    <w:p>
+      <w:pPr>
+        <w:keepNext w:val="false"/>
+        <w:spacing w:after="0" w:before="0" w:line="276" w:lineRule="auto"/>
+        <w:jc w:val="left"/>
+      </w:pPr>
+      <w:r>
+        <w:rPr>
+          <w:rFonts w:ascii="Calibri" w:cs="Calibri" w:eastAsia="Calibri" w:hAnsi="Calibri"/>
+          <w:b w:val="false"/>
+          <w:bCs w:val="false"/>
+          <w:i w:val="false"/>
+          <w:iCs w:val="false"/>
+          <w:color w:val="1A1A1A"/>
+          <w:sz w:val="22"/>
+          <w:szCs w:val="22"/>
+        </w:rPr>
+        <w:t xml:space="preserve"/>
+      </w:r>
+    </w:p>
+    <w:tbl>
+      <w:tblPr>
+        <w:tblW w:type="dxa" w:w="10080"/>
+        <w:tblBorders>
+          <w:top w:val="single" w:color="auto" w:sz="4"/>
+          <w:left w:val="single" w:color="auto" w:sz="4"/>
+          <w:bottom w:val="single" w:color="auto" w:sz="4"/>
+          <w:right w:val="single" w:color="auto" w:sz="4"/>
+          <w:insideH w:val="single" w:color="auto" w:sz="4"/>
+          <w:insideV w:val="single" w:color="auto" w:sz="4"/>
+        </w:tblBorders>
+      </w:tblPr>
+      <w:tblGrid>
+        <w:gridCol w:w="140"/>
+        <w:gridCol w:w="9940"/>
+      </w:tblGrid>
+      <w:tr>
+        <w:tc>
+          <w:tcPr>
+            <w:tcW w:type="dxa" w:w="140"/>
+            <w:tcBorders>
+              <w:top w:val="none"/>
+              <w:left w:val="none"/>
+              <w:bottom w:val="none"/>
+              <w:right w:val="none"/>
+            </w:tcBorders>
+            <w:shd w:fill="1A56A0" w:color="auto" w:val="clear"/>
+          </w:tcPr>
+          <w:p>
+            <w:pPr>
+              <w:keepNext w:val="false"/>
+              <w:spacing w:after="0" w:before="0" w:line="276" w:lineRule="auto"/>
+              <w:jc w:val="left"/>
+            </w:pPr>
+            <w:r>
+              <w:rPr>
+                <w:rFonts w:ascii="Calibri" w:cs="Calibri" w:eastAsia="Calibri" w:hAnsi="Calibri"/>
+                <w:b w:val="false"/>
+                <w:bCs w:val="false"/>
+                <w:i w:val="false"/>
+                <w:iCs w:val="false"/>
+                <w:color w:val="1A1A1A"/>
+                <w:sz w:val="22"/>
+                <w:szCs w:val="22"/>
+              </w:rPr>
+              <w:t xml:space="preserve"/>
+            </w:r>
+          </w:p>
+        </w:tc>
+        <w:tc>
+          <w:tcPr>
+            <w:tcW w:type="dxa" w:w="9940"/>
+            <w:tcBorders>
+              <w:top w:val="none"/>
+              <w:left w:val="none"/>
+              <w:bottom w:val="none"/>
+              <w:right w:val="none"/>
+            </w:tcBorders>
+            <w:shd w:fill="EBF3FB" w:color="auto" w:val="clear"/>
+            <w:tcMar>
+              <w:top w:type="dxa" w:w="120"/>
+              <w:left w:type="dxa" w:w="200"/>
+              <w:bottom w:type="dxa" w:w="120"/>
+              <w:right w:type="dxa" w:w="200"/>
+            </w:tcMar>
+          </w:tcPr>
+          <w:p>
+            <w:pPr>
+              <w:keepNext w:val="false"/>
+              <w:spacing w:after="40" w:before="0" w:line="276" w:lineRule="auto"/>
+              <w:jc w:val="left"/>
+            </w:pPr>
+            <w:r>
+              <w:rPr>
+                <w:rFonts w:ascii="Calibri" w:cs="Calibri" w:eastAsia="Calibri" w:hAnsi="Calibri"/>
+                <w:b/>
+                <w:bCs/>
+                <w:i w:val="false"/>
+                <w:iCs w:val="false"/>
+                <w:color w:val="1A56A0"/>
+                <w:sz w:val="20"/>
+                <w:szCs w:val="20"/>
+              </w:rPr>
+              <w:t xml:space="preserve">💡  Tip</w:t>
+            </w:r>
+          </w:p>
+          <w:p>
+            <w:pPr>
+              <w:keepNext w:val="false"/>
+              <w:spacing w:after="0" w:before="40" w:line="276" w:lineRule="auto"/>
+              <w:jc w:val="left"/>
+            </w:pPr>
+            <w:r>
+              <w:rPr>
+                <w:rFonts w:ascii="Calibri" w:cs="Calibri" w:eastAsia="Calibri" w:hAnsi="Calibri"/>
+                <w:b w:val="false"/>
+                <w:bCs w:val="false"/>
+                <w:i w:val="false"/>
+                <w:iCs w:val="false"/>
+                <w:color w:val="1A1A1A"/>
+                <w:sz w:val="21"/>
+                <w:szCs w:val="21"/>
+              </w:rPr>
+              <w:t xml:space="preserve">For a SAR activation: enable live forwarding at the command post laptop running APRS Command. All field operators with APRS trackers appear on both the APRS Command map (with movement trails, messaging, and ICS documentation) and the CalTopo map (with assignment segments, clue locations, and probability areas) simultaneously. The two tools complement each other rather than competing.</w:t>
+            </w:r>
+          </w:p>
+        </w:tc>
+      </w:tr>
+    </w:tbl>
+    <w:p>
+      <w:pPr>
+        <w:keepNext w:val="false"/>
+        <w:spacing w:after="0" w:before="0" w:line="276" w:lineRule="auto"/>
+        <w:jc w:val="left"/>
+      </w:pPr>
+      <w:r>
+        <w:rPr>
+          <w:rFonts w:ascii="Calibri" w:cs="Calibri" w:eastAsia="Calibri" w:hAnsi="Calibri"/>
+          <w:b w:val="false"/>
+          <w:bCs w:val="false"/>
+          <w:i w:val="false"/>
+          <w:iCs w:val="false"/>
+          <w:color w:val="1A1A1A"/>
+          <w:sz w:val="22"/>
+          <w:szCs w:val="22"/>
+        </w:rPr>
+        <w:t xml:space="preserve"/>
+      </w:r>
+    </w:p>
+    <w:p>
+      <w:pPr>
+        <w:keepNext/>
+        <w:spacing w:after="40" w:before="200"/>
+      </w:pPr>
+      <w:r>
+        <w:rPr>
+          <w:rFonts w:ascii="Calibri" w:cs="Calibri" w:eastAsia="Calibri" w:hAnsi="Calibri"/>
+          <w:b/>
+          <w:bCs/>
+          <w:i w:val="false"/>
+          <w:iCs w:val="false"/>
+          <w:color w:val="0F2A4A"/>
+          <w:sz w:val="22"/>
+          <w:szCs w:val="22"/>
+        </w:rPr>
+        <w:t xml:space="preserve">7.7.1  Weather Stations</w:t>
+      </w:r>
+    </w:p>
+    <w:p>
+      <w:pPr>
+        <w:keepNext w:val="false"/>
+        <w:spacing w:after="80" w:before="80" w:line="276" w:lineRule="auto"/>
+        <w:jc w:val="left"/>
+      </w:pPr>
+      <w:r>
+        <w:rPr>
+          <w:rFonts w:ascii="Calibri" w:cs="Calibri" w:eastAsia="Calibri" w:hAnsi="Calibri"/>
+          <w:b w:val="false"/>
+          <w:bCs w:val="false"/>
+          <w:i w:val="false"/>
+          <w:iCs w:val="false"/>
+          <w:color w:val="1A1A1A"/>
+          <w:sz w:val="22"/>
+          <w:szCs w:val="22"/>
+        </w:rPr>
+        <w:t xml:space="preserve">Shows weather readings from APRS weather stations in your area — temperature, wind speed and direction, barometric pressure, and rainfall. Click any weather station icon on the map to see its current data.</w:t>
+      </w:r>
+    </w:p>
+    <w:p>
+      <w:pPr>
+        <w:keepNext/>
+        <w:spacing w:after="40" w:before="200"/>
+      </w:pPr>
+      <w:r>
+        <w:rPr>
+          <w:rFonts w:ascii="Calibri" w:cs="Calibri" w:eastAsia="Calibri" w:hAnsi="Calibri"/>
+          <w:b/>
+          <w:bCs/>
+          <w:i w:val="false"/>
+          <w:iCs w:val="false"/>
+          <w:color w:val="0F2A4A"/>
+          <w:sz w:val="22"/>
+          <w:szCs w:val="22"/>
+        </w:rPr>
+        <w:t xml:space="preserve">7.7.2  NWS Weather Alerts</w:t>
+      </w:r>
+    </w:p>
+    <w:p>
+      <w:pPr>
+        <w:keepNext w:val="false"/>
+        <w:spacing w:after="80" w:before="80" w:line="276" w:lineRule="auto"/>
+        <w:jc w:val="left"/>
+      </w:pPr>
+      <w:r>
+        <w:rPr>
+          <w:rFonts w:ascii="Calibri" w:cs="Calibri" w:eastAsia="Calibri" w:hAnsi="Calibri"/>
+          <w:b w:val="false"/>
+          <w:bCs w:val="false"/>
+          <w:i w:val="false"/>
+          <w:iCs w:val="false"/>
+          <w:color w:val="1A1A1A"/>
+          <w:sz w:val="22"/>
+          <w:szCs w:val="22"/>
+        </w:rPr>
+        <w:t xml:space="preserve">Displays active National Weather Service alerts for your area — tornado warnings, severe thunderstorm warnings, winter storm advisories. A badge on the alert icon shows the count of active alerts. Alerts are color-coded by severity: deep red for Extreme, red for Severe, orange for Moderate, yellow for Minor.</w:t>
+      </w:r>
+    </w:p>
+    <w:p>
+      <w:pPr>
+        <w:keepNext/>
+        <w:spacing w:after="40" w:before="200"/>
+      </w:pPr>
+      <w:r>
+        <w:rPr>
+          <w:rFonts w:ascii="Calibri" w:cs="Calibri" w:eastAsia="Calibri" w:hAnsi="Calibri"/>
+          <w:b/>
+          <w:bCs/>
+          <w:i w:val="false"/>
+          <w:iCs w:val="false"/>
+          <w:color w:val="0F2A4A"/>
+          <w:sz w:val="22"/>
+          <w:szCs w:val="22"/>
+        </w:rPr>
+        <w:t xml:space="preserve">7.7.3  Radar Overlay</w:t>
+      </w:r>
+    </w:p>
+    <w:p>
+      <w:pPr>
+        <w:keepNext w:val="false"/>
+        <w:spacing w:after="80" w:before="80" w:line="276" w:lineRule="auto"/>
+        <w:jc w:val="left"/>
+      </w:pPr>
+      <w:r>
+        <w:rPr>
+          <w:rFonts w:ascii="Calibri" w:cs="Calibri" w:eastAsia="Calibri" w:hAnsi="Calibri"/>
+          <w:b w:val="false"/>
+          <w:bCs w:val="false"/>
+          <w:i w:val="false"/>
+          <w:iCs w:val="false"/>
+          <w:color w:val="1A1A1A"/>
+          <w:sz w:val="22"/>
+          <w:szCs w:val="22"/>
+        </w:rPr>
+        <w:t xml:space="preserve">See Section 6.10. Available from both the sidebar and Weather &gt; Radar Overlay: ON/OFF.</w:t>
+      </w:r>
+    </w:p>
+    <w:p>
+      <w:pPr>
+        <w:keepNext/>
+        <w:spacing w:after="40" w:before="200"/>
+      </w:pPr>
+      <w:r>
+        <w:rPr>
+          <w:rFonts w:ascii="Calibri" w:cs="Calibri" w:eastAsia="Calibri" w:hAnsi="Calibri"/>
+          <w:b/>
+          <w:bCs/>
+          <w:i w:val="false"/>
+          <w:iCs w:val="false"/>
+          <w:color w:val="0F2A4A"/>
+          <w:sz w:val="22"/>
+          <w:szCs w:val="22"/>
+        </w:rPr>
+        <w:t xml:space="preserve">7.7.4  Weather History</w:t>
+      </w:r>
+    </w:p>
+    <w:p>
+      <w:pPr>
+        <w:keepNext w:val="false"/>
+        <w:spacing w:after="80" w:before="80" w:line="276" w:lineRule="auto"/>
+        <w:jc w:val="left"/>
+      </w:pPr>
+      <w:r>
+        <w:rPr>
+          <w:rFonts w:ascii="Calibri" w:cs="Calibri" w:eastAsia="Calibri" w:hAnsi="Calibri"/>
+          <w:b w:val="false"/>
+          <w:bCs w:val="false"/>
+          <w:i w:val="false"/>
+          <w:iCs w:val="false"/>
+          <w:color w:val="1A1A1A"/>
+          <w:sz w:val="22"/>
+          <w:szCs w:val="22"/>
+        </w:rPr>
+        <w:t xml:space="preserve">The Weather window includes a History tab showing a rolling chart of temperature, humidity, and wind speed from a selected weather station. APRS Command stores up to 144 readings per station (24 hours at 10-minute intervals). History accumulates while APRS Command is running and is not saved between sessions.</w:t>
+      </w:r>
+    </w:p>
+    <w:p>
+      <w:pPr>
+        <w:spacing w:after="60" w:before="60"/>
+        <w:ind w:left="720" w:hanging="360"/>
+      </w:pPr>
+      <w:r>
+        <w:rPr>
+          <w:rFonts w:ascii="Calibri" w:cs="Calibri" w:eastAsia="Calibri" w:hAnsi="Calibri"/>
+          <w:b/>
+          <w:bCs/>
+          <w:i w:val="false"/>
+          <w:iCs w:val="false"/>
+          <w:color w:val="1A56A0"/>
+          <w:sz w:val="22"/>
+          <w:szCs w:val="22"/>
+        </w:rPr>
+        <w:t xml:space="preserve">1.  </w:t>
+      </w:r>
+      <w:r>
+        <w:rPr>
+          <w:rFonts w:ascii="Calibri" w:cs="Calibri" w:eastAsia="Calibri" w:hAnsi="Calibri"/>
+          <w:b w:val="false"/>
+          <w:bCs w:val="false"/>
+          <w:i w:val="false"/>
+          <w:iCs w:val="false"/>
+          <w:color w:val="1A1A1A"/>
+          <w:sz w:val="22"/>
+          <w:szCs w:val="22"/>
+        </w:rPr>
+        <w:t xml:space="preserve">Open the Weather window from the menu bar.</w:t>
+      </w:r>
+    </w:p>
+    <w:p>
+      <w:pPr>
+        <w:spacing w:after="60" w:before="60"/>
+        <w:ind w:left="720" w:hanging="360"/>
+      </w:pPr>
+      <w:r>
+        <w:rPr>
+          <w:rFonts w:ascii="Calibri" w:cs="Calibri" w:eastAsia="Calibri" w:hAnsi="Calibri"/>
+          <w:b/>
+          <w:bCs/>
+          <w:i w:val="false"/>
+          <w:iCs w:val="false"/>
+          <w:color w:val="1A56A0"/>
+          <w:sz w:val="22"/>
+          <w:szCs w:val="22"/>
+        </w:rPr>
+        <w:t xml:space="preserve">2.  </w:t>
+      </w:r>
+      <w:r>
+        <w:rPr>
+          <w:rFonts w:ascii="Calibri" w:cs="Calibri" w:eastAsia="Calibri" w:hAnsi="Calibri"/>
+          <w:b w:val="false"/>
+          <w:bCs w:val="false"/>
+          <w:i w:val="false"/>
+          <w:iCs w:val="false"/>
+          <w:color w:val="1A1A1A"/>
+          <w:sz w:val="22"/>
+          <w:szCs w:val="22"/>
+        </w:rPr>
+        <w:t xml:space="preserve">Click the History tab.</w:t>
+      </w:r>
+    </w:p>
+    <w:p>
+      <w:pPr>
+        <w:spacing w:after="60" w:before="60"/>
+        <w:ind w:left="720" w:hanging="360"/>
+      </w:pPr>
+      <w:r>
+        <w:rPr>
+          <w:rFonts w:ascii="Calibri" w:cs="Calibri" w:eastAsia="Calibri" w:hAnsi="Calibri"/>
+          <w:b/>
+          <w:bCs/>
+          <w:i w:val="false"/>
+          <w:iCs w:val="false"/>
+          <w:color w:val="1A56A0"/>
+          <w:sz w:val="22"/>
+          <w:szCs w:val="22"/>
+        </w:rPr>
+        <w:t xml:space="preserve">3.  </w:t>
+      </w:r>
+      <w:r>
+        <w:rPr>
+          <w:rFonts w:ascii="Calibri" w:cs="Calibri" w:eastAsia="Calibri" w:hAnsi="Calibri"/>
+          <w:b w:val="false"/>
+          <w:bCs w:val="false"/>
+          <w:i w:val="false"/>
+          <w:iCs w:val="false"/>
+          <w:color w:val="1A1A1A"/>
+          <w:sz w:val="22"/>
+          <w:szCs w:val="22"/>
+        </w:rPr>
+        <w:t xml:space="preserve">Select a station from the dropdown.</w:t>
+      </w:r>
+    </w:p>
+    <w:p>
+      <w:pPr>
+        <w:spacing w:after="60" w:before="60"/>
+        <w:ind w:left="720" w:hanging="360"/>
+      </w:pPr>
+      <w:r>
+        <w:rPr>
+          <w:rFonts w:ascii="Calibri" w:cs="Calibri" w:eastAsia="Calibri" w:hAnsi="Calibri"/>
+          <w:b/>
+          <w:bCs/>
+          <w:i w:val="false"/>
+          <w:iCs w:val="false"/>
+          <w:color w:val="1A56A0"/>
+          <w:sz w:val="22"/>
+          <w:szCs w:val="22"/>
+        </w:rPr>
+        <w:t xml:space="preserve">4.  </w:t>
+      </w:r>
+      <w:r>
+        <w:rPr>
+          <w:rFonts w:ascii="Calibri" w:cs="Calibri" w:eastAsia="Calibri" w:hAnsi="Calibri"/>
+          <w:b w:val="false"/>
+          <w:bCs w:val="false"/>
+          <w:i w:val="false"/>
+          <w:iCs w:val="false"/>
+          <w:color w:val="1A1A1A"/>
+          <w:sz w:val="22"/>
+          <w:szCs w:val="22"/>
+        </w:rPr>
+        <w:t xml:space="preserve">Charts appear for temperature (°F), humidity (%), and wind speed (mph).</w:t>
+      </w:r>
+    </w:p>
+    <w:p>
+      <w:pPr>
+        <w:keepNext/>
+        <w:spacing w:after="40" w:before="200"/>
+      </w:pPr>
+      <w:r>
+        <w:rPr>
+          <w:rFonts w:ascii="Calibri" w:cs="Calibri" w:eastAsia="Calibri" w:hAnsi="Calibri"/>
+          <w:b/>
+          <w:bCs/>
+          <w:i w:val="false"/>
+          <w:iCs w:val="false"/>
+          <w:color w:val="0F2A4A"/>
+          <w:sz w:val="22"/>
+          <w:szCs w:val="22"/>
+        </w:rPr>
+        <w:t xml:space="preserve">7.7.5  Connecting a Home Weather Station</w:t>
       </w:r>
     </w:p>
     <w:p>
@@ -21804,7 +23542,7 @@
           <w:sz w:val="24"/>
           <w:szCs w:val="24"/>
         </w:rPr>
-        <w:t xml:space="preserve">7.7  Tools</w:t>
+        <w:t xml:space="preserve">7.8  Tools</w:t>
       </w:r>
     </w:p>
     <w:p>
@@ -22698,7 +24436,7 @@
           <w:sz w:val="22"/>
           <w:szCs w:val="22"/>
         </w:rPr>
-        <w:t xml:space="preserve">7.7.5  Coverage Prediction</w:t>
+        <w:t xml:space="preserve">7.8.5  Coverage Prediction</w:t>
       </w:r>
     </w:p>
     <w:p>
@@ -23248,7 +24986,7 @@
           <w:sz w:val="24"/>
           <w:szCs w:val="24"/>
         </w:rPr>
-        <w:t xml:space="preserve">7.8  Packet Statistics Dashboard</w:t>
+        <w:t xml:space="preserve">7.9  Packet Statistics Dashboard</w:t>
       </w:r>
     </w:p>
     <w:p>
@@ -24765,7 +26503,7 @@
           <w:sz w:val="24"/>
           <w:szCs w:val="24"/>
         </w:rPr>
-        <w:t xml:space="preserve">7.9  Session Templates</w:t>
+        <w:t xml:space="preserve">7.10  Session Templates</w:t>
       </w:r>
     </w:p>
     <w:p>
@@ -26596,7 +28334,7 @@
           <w:sz w:val="24"/>
           <w:szCs w:val="24"/>
         </w:rPr>
-        <w:t xml:space="preserve">7.10  Voice Readout</w:t>
+        <w:t xml:space="preserve">7.11  Voice Readout</w:t>
       </w:r>
     </w:p>
     <w:p>
@@ -28033,7 +29771,7 @@
           <w:sz w:val="24"/>
           <w:szCs w:val="24"/>
         </w:rPr>
-        <w:t xml:space="preserve">7.11  Events — ICS Documentation</w:t>
+        <w:t xml:space="preserve">7.12  Events — ICS Documentation</w:t>
       </w:r>
     </w:p>
     <w:p>
@@ -28626,7 +30364,7 @@
           <w:sz w:val="24"/>
           <w:szCs w:val="24"/>
         </w:rPr>
-        <w:t xml:space="preserve">7.12  Telemetry Monitor</w:t>
+        <w:t xml:space="preserve">7.13  Telemetry Monitor</w:t>
       </w:r>
     </w:p>
     <w:p>
@@ -29394,7 +31132,7 @@
           <w:sz w:val="24"/>
           <w:szCs w:val="24"/>
         </w:rPr>
-        <w:t xml:space="preserve">7.13  Scheduled Beacons</w:t>
+        <w:t xml:space="preserve">7.14  Scheduled Beacons</w:t>
       </w:r>
     </w:p>
     <w:p>
@@ -30064,7 +31802,7 @@
           <w:sz w:val="24"/>
           <w:szCs w:val="24"/>
         </w:rPr>
-        <w:t xml:space="preserve">7.14  Keyboard Shortcuts</w:t>
+        <w:t xml:space="preserve">7.15  Keyboard Shortcuts</w:t>
       </w:r>
     </w:p>
     <w:p>
@@ -30548,7 +32286,7 @@
           <w:sz w:val="24"/>
           <w:szCs w:val="24"/>
         </w:rPr>
-        <w:t xml:space="preserve">7.15  Dead Reckoning</w:t>
+        <w:t xml:space="preserve">7.16  Dead Reckoning</w:t>
       </w:r>
     </w:p>
     <w:p>
@@ -30816,7 +32554,7 @@
           <w:sz w:val="24"/>
           <w:szCs w:val="24"/>
         </w:rPr>
-        <w:t xml:space="preserve">7.16  Software Updates</w:t>
+        <w:t xml:space="preserve">7.17  Software Updates</w:t>
       </w:r>
     </w:p>
     <w:p>
@@ -31065,7 +32803,7 @@
           <w:sz w:val="24"/>
           <w:szCs w:val="24"/>
         </w:rPr>
-        <w:t xml:space="preserve">7.17  Mobile Companion Web View</w:t>
+        <w:t xml:space="preserve">7.18  Mobile Companion Web View</w:t>
       </w:r>
     </w:p>
     <w:p>

</xml_diff>

<commit_message>
Fix User Manual to v1.1, add Information Guide
</commit_message>
<xml_diff>
--- a/docs/APRS_Command_User_Manual.docx
+++ b/docs/APRS_Command_User_Manual.docx
@@ -387,7 +387,7 @@
                 <w:sz w:val="22"/>
                 <w:szCs w:val="22"/>
               </w:rPr>
-              <w:t xml:space="preserve">1.0  ·  July 2026</w:t>
+              <w:t xml:space="preserve">1.1  ·  Updated July 27, 2026  ·  Applies to v0.5.0-alpha</w:t>
             </w:r>
           </w:p>
           <w:p>
@@ -3623,7 +3623,7 @@
           <w:sz w:val="22"/>
           <w:szCs w:val="22"/>
         </w:rPr>
-        <w:t xml:space="preserve">APRS Command is distributed as a zip file containing a folder of files — not a traditional installer. There is no setup wizard, no registry entries, and nothing written outside the folder you unzip. To remove APRS Command from any platform, delete the folder. Your settings are stored separately in your user profile and are not affected by deleting or replacing the app folder.</w:t>
+        <w:t xml:space="preserve">APRS Command ships two ways on every platform: a native installer (recommended for most people) and a portable archive (zip or tar.gz) that runs from any folder with no installation step at all. The installer places APRS Command in the normal application location for your platform and adds Start Menu / Desktop / Applications entries; the portable archive is entirely self-contained and leaves nothing outside the folder you extract it to. Either way, your settings are stored separately in your user profile and are unaffected by reinstalling, upgrading, or moving the app folder. No administrator account or special permissions are required to run APRS Command — only the Windows installer itself needs administrator rights to write to Program Files.</w:t>
       </w:r>
     </w:p>
     <w:p>
@@ -4259,7 +4259,7 @@
           <w:sz w:val="22"/>
           <w:szCs w:val="22"/>
         </w:rPr>
-        <w:t xml:space="preserve">Visit github.com/KE4CON/APRS-Command/releases and download the zip file matching your platform. The filename includes the version number and platform name.</w:t>
+        <w:t xml:space="preserve">Visit github.com/KE4CON/APRS-Command/releases and download the file matching your platform. Each release lists both an installer (.dmg, -Setup.exe, .deb, or .rpm) and a portable archive (.zip or .tar.gz) for every platform — the table below shows both. The filename includes the version number and platform name.</w:t>
       </w:r>
     </w:p>
     <w:tbl>
@@ -4523,7 +4523,7 @@
                 <w:sz w:val="21"/>
                 <w:szCs w:val="21"/>
               </w:rPr>
-              <w:t xml:space="preserve">APRSCommand-vX.X.X-macos-arm64.zip</w:t>
+              <w:t xml:space="preserve">Installer: APRSCommand-vX.X.X-macos-arm64.dmg  ·  Portable: APRSCommand-vX.X.X-macos-arm64.zip</w:t>
             </w:r>
           </w:p>
         </w:tc>
@@ -4601,7 +4601,7 @@
                 <w:sz w:val="21"/>
                 <w:szCs w:val="21"/>
               </w:rPr>
-              <w:t xml:space="preserve">APRSCommand-vX.X.X-macos-x64.zip</w:t>
+              <w:t xml:space="preserve">Installer: APRSCommand-vX.X.X-macos-x64.dmg  ·  Portable: APRSCommand-vX.X.X-macos-x64.zip</w:t>
             </w:r>
           </w:p>
         </w:tc>
@@ -4677,7 +4677,7 @@
                 <w:sz w:val="21"/>
                 <w:szCs w:val="21"/>
               </w:rPr>
-              <w:t xml:space="preserve">APRSCommand-vX.X.X-windows-x64.zip</w:t>
+              <w:t xml:space="preserve">Installer: APRSCommand-vX.X.X-windows-x64-Setup.exe  ·  Portable: APRSCommand-vX.X.X-windows-x64.zip</w:t>
             </w:r>
           </w:p>
         </w:tc>
@@ -4755,7 +4755,7 @@
                 <w:sz w:val="21"/>
                 <w:szCs w:val="21"/>
               </w:rPr>
-              <w:t xml:space="preserve">APRSCommand-vX.X.X-linux-x64.zip</w:t>
+              <w:t xml:space="preserve">Installer: aprs-command_X.Y.Z_amd64.deb (or .rpm)  ·  Portable: APRSCommand-vX.X.X-linux-x64.tar.gz</w:t>
             </w:r>
           </w:p>
         </w:tc>
@@ -4831,7 +4831,7 @@
                 <w:sz w:val="21"/>
                 <w:szCs w:val="21"/>
               </w:rPr>
-              <w:t xml:space="preserve">APRSCommand-vX.X.X-linux-arm64.zip</w:t>
+              <w:t xml:space="preserve">Installer: aprs-command_X.Y.Z_arm64.deb (or .rpm)  ·  Portable: APRSCommand-vX.X.X-linux-arm64.tar.gz</w:t>
             </w:r>
           </w:p>
         </w:tc>
@@ -4960,7 +4960,7 @@
                 <w:sz w:val="21"/>
                 <w:szCs w:val="21"/>
               </w:rPr>
-              <w:t xml:space="preserve">Raspberry Pi: download the ARM64 version (-linux-arm64.zip) — not the Linux x64 version. The x64 version targets standard PC processors and will not run on Pi hardware.</w:t>
+              <w:t xml:space="preserve">Raspberry Pi: download the ARM64 build (filenames containing -arm64, e.g. aprs-command_X.Y.Z_arm64.deb or APRSCommand-vX.Y.Z-linux-arm64.tar.gz) — not the Linux x64 version. The x64 version targets standard PC processors and will not run on Pi hardware.</w:t>
             </w:r>
           </w:p>
           <w:p>
@@ -5045,7 +5045,173 @@
           <w:sz w:val="22"/>
           <w:szCs w:val="22"/>
         </w:rPr>
-        <w:t xml:space="preserve">APRS Command ships as a folder of files inside a zip — not as a .app bundle. You run it directly from the folder. macOS Gatekeeper will block it on first launch because it is not signed with an Apple developer certificate. The steps below clear that block.</w:t>
+        <w:t xml:space="preserve">APRS Command offers a standard .dmg installer for macOS, plus a portable zip for anyone who prefers to run the app directly from a folder with no installation step. Neither path is code-signed with an Apple developer certificate, so macOS Gatekeeper will block first launch either way — the steps below clear that block for whichever method you choose.</w:t>
+      </w:r>
+    </w:p>
+    <w:p>
+      <w:pPr>
+        <w:keepNext/>
+        <w:spacing w:after="40" w:before="200"/>
+      </w:pPr>
+      <w:r>
+        <w:rPr>
+          <w:rFonts w:ascii="Calibri" w:cs="Calibri" w:eastAsia="Calibri" w:hAnsi="Calibri"/>
+          <w:b/>
+          <w:bCs/>
+          <w:i w:val="false"/>
+          <w:iCs w:val="false"/>
+          <w:color w:val="0F2A4A"/>
+          <w:sz w:val="22"/>
+          <w:szCs w:val="22"/>
+        </w:rPr>
+        <w:t xml:space="preserve">Installer Method (Recommended)</w:t>
+      </w:r>
+    </w:p>
+    <w:p>
+      <w:pPr>
+        <w:spacing w:after="60" w:before="60"/>
+        <w:ind w:left="720" w:hanging="360"/>
+      </w:pPr>
+      <w:r>
+        <w:rPr>
+          <w:rFonts w:ascii="Calibri" w:cs="Calibri" w:eastAsia="Calibri" w:hAnsi="Calibri"/>
+          <w:b/>
+          <w:bCs/>
+          <w:i w:val="false"/>
+          <w:iCs w:val="false"/>
+          <w:color w:val="1A56A0"/>
+          <w:sz w:val="22"/>
+          <w:szCs w:val="22"/>
+        </w:rPr>
+        <w:t xml:space="preserve">1.  </w:t>
+      </w:r>
+      <w:r>
+        <w:rPr>
+          <w:rFonts w:ascii="Calibri" w:cs="Calibri" w:eastAsia="Calibri" w:hAnsi="Calibri"/>
+          <w:b w:val="false"/>
+          <w:bCs w:val="false"/>
+          <w:i w:val="false"/>
+          <w:iCs w:val="false"/>
+          <w:color w:val="1A1A1A"/>
+          <w:sz w:val="22"/>
+          <w:szCs w:val="22"/>
+        </w:rPr>
+        <w:t xml:space="preserve">Download APRSCommand-vX.Y.Z-macos-arm64.dmg (Apple Silicon M1/M2/M3/M4) or APRSCommand-vX.Y.Z-macos-x64.dmg (Intel Mac).</w:t>
+      </w:r>
+    </w:p>
+    <w:p>
+      <w:pPr>
+        <w:spacing w:after="60" w:before="60"/>
+        <w:ind w:left="720" w:hanging="360"/>
+      </w:pPr>
+      <w:r>
+        <w:rPr>
+          <w:rFonts w:ascii="Calibri" w:cs="Calibri" w:eastAsia="Calibri" w:hAnsi="Calibri"/>
+          <w:b/>
+          <w:bCs/>
+          <w:i w:val="false"/>
+          <w:iCs w:val="false"/>
+          <w:color w:val="1A56A0"/>
+          <w:sz w:val="22"/>
+          <w:szCs w:val="22"/>
+        </w:rPr>
+        <w:t xml:space="preserve">2.  </w:t>
+      </w:r>
+      <w:r>
+        <w:rPr>
+          <w:rFonts w:ascii="Calibri" w:cs="Calibri" w:eastAsia="Calibri" w:hAnsi="Calibri"/>
+          <w:b w:val="false"/>
+          <w:bCs w:val="false"/>
+          <w:i w:val="false"/>
+          <w:iCs w:val="false"/>
+          <w:color w:val="1A1A1A"/>
+          <w:sz w:val="22"/>
+          <w:szCs w:val="22"/>
+        </w:rPr>
+        <w:t xml:space="preserve">Double-click the .dmg file to mount it.</w:t>
+      </w:r>
+    </w:p>
+    <w:p>
+      <w:pPr>
+        <w:spacing w:after="60" w:before="60"/>
+        <w:ind w:left="720" w:hanging="360"/>
+      </w:pPr>
+      <w:r>
+        <w:rPr>
+          <w:rFonts w:ascii="Calibri" w:cs="Calibri" w:eastAsia="Calibri" w:hAnsi="Calibri"/>
+          <w:b/>
+          <w:bCs/>
+          <w:i w:val="false"/>
+          <w:iCs w:val="false"/>
+          <w:color w:val="1A56A0"/>
+          <w:sz w:val="22"/>
+          <w:szCs w:val="22"/>
+        </w:rPr>
+        <w:t xml:space="preserve">3.  </w:t>
+      </w:r>
+      <w:r>
+        <w:rPr>
+          <w:rFonts w:ascii="Calibri" w:cs="Calibri" w:eastAsia="Calibri" w:hAnsi="Calibri"/>
+          <w:b w:val="false"/>
+          <w:bCs w:val="false"/>
+          <w:i w:val="false"/>
+          <w:iCs w:val="false"/>
+          <w:color w:val="1A1A1A"/>
+          <w:sz w:val="22"/>
+          <w:szCs w:val="22"/>
+        </w:rPr>
+        <w:t xml:space="preserve">Drag APRS Command.app into your Applications folder.</w:t>
+      </w:r>
+    </w:p>
+    <w:p>
+      <w:pPr>
+        <w:spacing w:after="60" w:before="60"/>
+        <w:ind w:left="720" w:hanging="360"/>
+      </w:pPr>
+      <w:r>
+        <w:rPr>
+          <w:rFonts w:ascii="Calibri" w:cs="Calibri" w:eastAsia="Calibri" w:hAnsi="Calibri"/>
+          <w:b/>
+          <w:bCs/>
+          <w:i w:val="false"/>
+          <w:iCs w:val="false"/>
+          <w:color w:val="1A56A0"/>
+          <w:sz w:val="22"/>
+          <w:szCs w:val="22"/>
+        </w:rPr>
+        <w:t xml:space="preserve">4.  </w:t>
+      </w:r>
+      <w:r>
+        <w:rPr>
+          <w:rFonts w:ascii="Calibri" w:cs="Calibri" w:eastAsia="Calibri" w:hAnsi="Calibri"/>
+          <w:b w:val="false"/>
+          <w:bCs w:val="false"/>
+          <w:i w:val="false"/>
+          <w:iCs w:val="false"/>
+          <w:color w:val="1A1A1A"/>
+          <w:sz w:val="22"/>
+          <w:szCs w:val="22"/>
+        </w:rPr>
+        <w:t xml:space="preserve">First launch only: in Applications, right-click (or Control-click) APRS Command, choose Open, then click Open again in the confirmation dialog. macOS remembers this exception — every launch after the first works normally by double-clicking.</w:t>
+      </w:r>
+    </w:p>
+    <w:p>
+      <w:pPr>
+        <w:keepNext/>
+        <w:spacing w:after="40" w:before="200"/>
+      </w:pPr>
+      <w:r>
+        <w:rPr>
+          <w:rFonts w:ascii="Calibri" w:cs="Calibri" w:eastAsia="Calibri" w:hAnsi="Calibri"/>
+          <w:b/>
+          <w:bCs/>
+          <w:i w:val="false"/>
+          <w:iCs w:val="false"/>
+          <w:color w:val="0F2A4A"/>
+          <w:sz w:val="22"/>
+          <w:szCs w:val="22"/>
+        </w:rPr>
+        <w:t xml:space="preserve">Portable Archive Method (Alternative)</w:t>
       </w:r>
     </w:p>
     <w:p>
@@ -5635,7 +5801,205 @@
           <w:sz w:val="22"/>
           <w:szCs w:val="22"/>
         </w:rPr>
-        <w:t xml:space="preserve">APRS Command ships as a folder of files inside a zip. There is no .msi or setup.exe installer. You run Aprs.Desktop.exe directly from the unzipped folder. Windows SmartScreen will warn you on first launch because the executable is not signed with a code-signing certificate.</w:t>
+        <w:t xml:space="preserve">APRS Command offers a standard Setup.exe installer for Windows, plus a portable zip you can run directly with no installation step. Neither path is signed with a code-signing certificate, so Windows SmartScreen will warn on first launch either way — the steps below show what to expect and how to proceed for whichever method you choose.</w:t>
+      </w:r>
+    </w:p>
+    <w:p>
+      <w:pPr>
+        <w:keepNext/>
+        <w:spacing w:after="40" w:before="200"/>
+      </w:pPr>
+      <w:r>
+        <w:rPr>
+          <w:rFonts w:ascii="Calibri" w:cs="Calibri" w:eastAsia="Calibri" w:hAnsi="Calibri"/>
+          <w:b/>
+          <w:bCs/>
+          <w:i w:val="false"/>
+          <w:iCs w:val="false"/>
+          <w:color w:val="0F2A4A"/>
+          <w:sz w:val="22"/>
+          <w:szCs w:val="22"/>
+        </w:rPr>
+        <w:t xml:space="preserve">Installer Method (Recommended)</w:t>
+      </w:r>
+    </w:p>
+    <w:p>
+      <w:pPr>
+        <w:spacing w:after="60" w:before="60"/>
+        <w:ind w:left="720" w:hanging="360"/>
+      </w:pPr>
+      <w:r>
+        <w:rPr>
+          <w:rFonts w:ascii="Calibri" w:cs="Calibri" w:eastAsia="Calibri" w:hAnsi="Calibri"/>
+          <w:b/>
+          <w:bCs/>
+          <w:i w:val="false"/>
+          <w:iCs w:val="false"/>
+          <w:color w:val="1A56A0"/>
+          <w:sz w:val="22"/>
+          <w:szCs w:val="22"/>
+        </w:rPr>
+        <w:t xml:space="preserve">1.  </w:t>
+      </w:r>
+      <w:r>
+        <w:rPr>
+          <w:rFonts w:ascii="Calibri" w:cs="Calibri" w:eastAsia="Calibri" w:hAnsi="Calibri"/>
+          <w:b w:val="false"/>
+          <w:bCs w:val="false"/>
+          <w:i w:val="false"/>
+          <w:iCs w:val="false"/>
+          <w:color w:val="1A1A1A"/>
+          <w:sz w:val="22"/>
+          <w:szCs w:val="22"/>
+        </w:rPr>
+        <w:t xml:space="preserve">Download APRSCommand-vX.Y.Z-windows-x64-Setup.exe.</w:t>
+      </w:r>
+    </w:p>
+    <w:p>
+      <w:pPr>
+        <w:spacing w:after="60" w:before="60"/>
+        <w:ind w:left="720" w:hanging="360"/>
+      </w:pPr>
+      <w:r>
+        <w:rPr>
+          <w:rFonts w:ascii="Calibri" w:cs="Calibri" w:eastAsia="Calibri" w:hAnsi="Calibri"/>
+          <w:b/>
+          <w:bCs/>
+          <w:i w:val="false"/>
+          <w:iCs w:val="false"/>
+          <w:color w:val="1A56A0"/>
+          <w:sz w:val="22"/>
+          <w:szCs w:val="22"/>
+        </w:rPr>
+        <w:t xml:space="preserve">2.  </w:t>
+      </w:r>
+      <w:r>
+        <w:rPr>
+          <w:rFonts w:ascii="Calibri" w:cs="Calibri" w:eastAsia="Calibri" w:hAnsi="Calibri"/>
+          <w:b w:val="false"/>
+          <w:bCs w:val="false"/>
+          <w:i w:val="false"/>
+          <w:iCs w:val="false"/>
+          <w:color w:val="1A1A1A"/>
+          <w:sz w:val="22"/>
+          <w:szCs w:val="22"/>
+        </w:rPr>
+        <w:t xml:space="preserve">Double-click to run it.</w:t>
+      </w:r>
+    </w:p>
+    <w:p>
+      <w:pPr>
+        <w:spacing w:after="60" w:before="60"/>
+        <w:ind w:left="720" w:hanging="360"/>
+      </w:pPr>
+      <w:r>
+        <w:rPr>
+          <w:rFonts w:ascii="Calibri" w:cs="Calibri" w:eastAsia="Calibri" w:hAnsi="Calibri"/>
+          <w:b/>
+          <w:bCs/>
+          <w:i w:val="false"/>
+          <w:iCs w:val="false"/>
+          <w:color w:val="1A56A0"/>
+          <w:sz w:val="22"/>
+          <w:szCs w:val="22"/>
+        </w:rPr>
+        <w:t xml:space="preserve">3.  </w:t>
+      </w:r>
+      <w:r>
+        <w:rPr>
+          <w:rFonts w:ascii="Calibri" w:cs="Calibri" w:eastAsia="Calibri" w:hAnsi="Calibri"/>
+          <w:b w:val="false"/>
+          <w:bCs w:val="false"/>
+          <w:i w:val="false"/>
+          <w:iCs w:val="false"/>
+          <w:color w:val="1A1A1A"/>
+          <w:sz w:val="22"/>
+          <w:szCs w:val="22"/>
+        </w:rPr>
+        <w:t xml:space="preserve">First launch only: if SmartScreen shows "Windows protected your PC," click More info, then Run anyway.</w:t>
+      </w:r>
+    </w:p>
+    <w:p>
+      <w:pPr>
+        <w:spacing w:after="60" w:before="60"/>
+        <w:ind w:left="720" w:hanging="360"/>
+      </w:pPr>
+      <w:r>
+        <w:rPr>
+          <w:rFonts w:ascii="Calibri" w:cs="Calibri" w:eastAsia="Calibri" w:hAnsi="Calibri"/>
+          <w:b/>
+          <w:bCs/>
+          <w:i w:val="false"/>
+          <w:iCs w:val="false"/>
+          <w:color w:val="1A56A0"/>
+          <w:sz w:val="22"/>
+          <w:szCs w:val="22"/>
+        </w:rPr>
+        <w:t xml:space="preserve">4.  </w:t>
+      </w:r>
+      <w:r>
+        <w:rPr>
+          <w:rFonts w:ascii="Calibri" w:cs="Calibri" w:eastAsia="Calibri" w:hAnsi="Calibri"/>
+          <w:b w:val="false"/>
+          <w:bCs w:val="false"/>
+          <w:i w:val="false"/>
+          <w:iCs w:val="false"/>
+          <w:color w:val="1A1A1A"/>
+          <w:sz w:val="22"/>
+          <w:szCs w:val="22"/>
+        </w:rPr>
+        <w:t xml:space="preserve">APRS Command installs to C:\Program Files\APRS Command with Start Menu and Desktop shortcuts.</w:t>
+      </w:r>
+    </w:p>
+    <w:p>
+      <w:pPr>
+        <w:spacing w:after="60" w:before="60"/>
+        <w:ind w:left="720" w:hanging="360"/>
+      </w:pPr>
+      <w:r>
+        <w:rPr>
+          <w:rFonts w:ascii="Calibri" w:cs="Calibri" w:eastAsia="Calibri" w:hAnsi="Calibri"/>
+          <w:b/>
+          <w:bCs/>
+          <w:i w:val="false"/>
+          <w:iCs w:val="false"/>
+          <w:color w:val="1A56A0"/>
+          <w:sz w:val="22"/>
+          <w:szCs w:val="22"/>
+        </w:rPr>
+        <w:t xml:space="preserve">5.  </w:t>
+      </w:r>
+      <w:r>
+        <w:rPr>
+          <w:rFonts w:ascii="Calibri" w:cs="Calibri" w:eastAsia="Calibri" w:hAnsi="Calibri"/>
+          <w:b w:val="false"/>
+          <w:bCs w:val="false"/>
+          <w:i w:val="false"/>
+          <w:iCs w:val="false"/>
+          <w:color w:val="1A1A1A"/>
+          <w:sz w:val="22"/>
+          <w:szCs w:val="22"/>
+        </w:rPr>
+        <w:t xml:space="preserve">To uninstall later: Settings → Apps → APRS Command.</w:t>
+      </w:r>
+    </w:p>
+    <w:p>
+      <w:pPr>
+        <w:keepNext/>
+        <w:spacing w:after="40" w:before="200"/>
+      </w:pPr>
+      <w:r>
+        <w:rPr>
+          <w:rFonts w:ascii="Calibri" w:cs="Calibri" w:eastAsia="Calibri" w:hAnsi="Calibri"/>
+          <w:b/>
+          <w:bCs/>
+          <w:i w:val="false"/>
+          <w:iCs w:val="false"/>
+          <w:color w:val="0F2A4A"/>
+          <w:sz w:val="22"/>
+          <w:szCs w:val="22"/>
+        </w:rPr>
+        <w:t xml:space="preserve">Portable Archive Method (Alternative)</w:t>
       </w:r>
     </w:p>
     <w:p>
@@ -6320,7 +6684,26 @@
           <w:sz w:val="22"/>
           <w:szCs w:val="22"/>
         </w:rPr>
-        <w:t xml:space="preserve">Installation on any 64-bit Linux distribution follows the same steps. No package manager interaction or sudo access is required — the zip is self-contained.</w:t>
+        <w:t xml:space="preserve">APRS Command provides native .deb packages (Debian, Ubuntu, Linux Mint, Raspberry Pi OS, and derivatives) and .rpm packages (Fedora, RHEL, CentOS, openSUSE, and derivatives), plus a portable tar.gz archive that runs on any 64-bit Linux distribution with no package manager interaction or sudo access required at all.</w:t>
+      </w:r>
+    </w:p>
+    <w:p>
+      <w:pPr>
+        <w:keepNext/>
+        <w:spacing w:after="40" w:before="200"/>
+      </w:pPr>
+      <w:r>
+        <w:rPr>
+          <w:rFonts w:ascii="Calibri" w:cs="Calibri" w:eastAsia="Calibri" w:hAnsi="Calibri"/>
+          <w:b/>
+          <w:bCs/>
+          <w:i w:val="false"/>
+          <w:iCs w:val="false"/>
+          <w:color w:val="0F2A4A"/>
+          <w:sz w:val="22"/>
+          <w:szCs w:val="22"/>
+        </w:rPr>
+        <w:t xml:space="preserve">Installer Method (Recommended)</w:t>
       </w:r>
     </w:p>
     <w:p>
@@ -6352,7 +6735,7 @@
           <w:sz w:val="22"/>
           <w:szCs w:val="22"/>
         </w:rPr>
-        <w:t xml:space="preserve">Unzip the download: unzip APRSCommand-vX.X.X-linux-x64.zip</w:t>
+        <w:t xml:space="preserve">Debian, Ubuntu, Linux Mint, Raspberry Pi OS, and derivatives: sudo dpkg -i aprs-command_X.Y.Z_amd64.deb</w:t>
       </w:r>
     </w:p>
     <w:p>
@@ -6384,7 +6767,154 @@
           <w:sz w:val="22"/>
           <w:szCs w:val="22"/>
         </w:rPr>
-        <w:t xml:space="preserve">Enter the unzipped folder: cd APRSCommand-vX.X.X-linux-x64</w:t>
+        <w:t xml:space="preserve">Fedora, RHEL, CentOS, openSUSE, and derivatives: sudo rpm -i aprs-command-X.Y.Z-1.x86_64.rpm</w:t>
+      </w:r>
+    </w:p>
+    <w:p>
+      <w:pPr>
+        <w:spacing w:after="60" w:before="60"/>
+        <w:ind w:left="720" w:hanging="360"/>
+      </w:pPr>
+      <w:r>
+        <w:rPr>
+          <w:rFonts w:ascii="Calibri" w:cs="Calibri" w:eastAsia="Calibri" w:hAnsi="Calibri"/>
+          <w:b/>
+          <w:bCs/>
+          <w:i w:val="false"/>
+          <w:iCs w:val="false"/>
+          <w:color w:val="1A56A0"/>
+          <w:sz w:val="22"/>
+          <w:szCs w:val="22"/>
+        </w:rPr>
+        <w:t xml:space="preserve">3.  </w:t>
+      </w:r>
+      <w:r>
+        <w:rPr>
+          <w:rFonts w:ascii="Calibri" w:cs="Calibri" w:eastAsia="Calibri" w:hAnsi="Calibri"/>
+          <w:b w:val="false"/>
+          <w:bCs w:val="false"/>
+          <w:i w:val="false"/>
+          <w:iCs w:val="false"/>
+          <w:color w:val="1A1A1A"/>
+          <w:sz w:val="22"/>
+          <w:szCs w:val="22"/>
+        </w:rPr>
+        <w:t xml:space="preserve">APRS Command installs to /opt/aprs-command/ with a launcher at /usr/local/bin/aprs-command and a .desktop entry added to your application menu automatically.</w:t>
+      </w:r>
+    </w:p>
+    <w:p>
+      <w:pPr>
+        <w:spacing w:after="60" w:before="60"/>
+        <w:ind w:left="720" w:hanging="360"/>
+      </w:pPr>
+      <w:r>
+        <w:rPr>
+          <w:rFonts w:ascii="Calibri" w:cs="Calibri" w:eastAsia="Calibri" w:hAnsi="Calibri"/>
+          <w:b/>
+          <w:bCs/>
+          <w:i w:val="false"/>
+          <w:iCs w:val="false"/>
+          <w:color w:val="1A56A0"/>
+          <w:sz w:val="22"/>
+          <w:szCs w:val="22"/>
+        </w:rPr>
+        <w:t xml:space="preserve">4.  </w:t>
+      </w:r>
+      <w:r>
+        <w:rPr>
+          <w:rFonts w:ascii="Calibri" w:cs="Calibri" w:eastAsia="Calibri" w:hAnsi="Calibri"/>
+          <w:b w:val="false"/>
+          <w:bCs w:val="false"/>
+          <w:i w:val="false"/>
+          <w:iCs w:val="false"/>
+          <w:color w:val="1A1A1A"/>
+          <w:sz w:val="22"/>
+          <w:szCs w:val="22"/>
+        </w:rPr>
+        <w:t xml:space="preserve">Launch from a terminal (aprs-command) or from your application menu.</w:t>
+      </w:r>
+    </w:p>
+    <w:p>
+      <w:pPr>
+        <w:keepNext/>
+        <w:spacing w:after="40" w:before="200"/>
+      </w:pPr>
+      <w:r>
+        <w:rPr>
+          <w:rFonts w:ascii="Calibri" w:cs="Calibri" w:eastAsia="Calibri" w:hAnsi="Calibri"/>
+          <w:b/>
+          <w:bCs/>
+          <w:i w:val="false"/>
+          <w:iCs w:val="false"/>
+          <w:color w:val="0F2A4A"/>
+          <w:sz w:val="22"/>
+          <w:szCs w:val="22"/>
+        </w:rPr>
+        <w:t xml:space="preserve">Portable Archive Method (Alternative)</w:t>
+      </w:r>
+    </w:p>
+    <w:p>
+      <w:pPr>
+        <w:spacing w:after="60" w:before="60"/>
+        <w:ind w:left="720" w:hanging="360"/>
+      </w:pPr>
+      <w:r>
+        <w:rPr>
+          <w:rFonts w:ascii="Calibri" w:cs="Calibri" w:eastAsia="Calibri" w:hAnsi="Calibri"/>
+          <w:b/>
+          <w:bCs/>
+          <w:i w:val="false"/>
+          <w:iCs w:val="false"/>
+          <w:color w:val="1A56A0"/>
+          <w:sz w:val="22"/>
+          <w:szCs w:val="22"/>
+        </w:rPr>
+        <w:t xml:space="preserve">1.  </w:t>
+      </w:r>
+      <w:r>
+        <w:rPr>
+          <w:rFonts w:ascii="Calibri" w:cs="Calibri" w:eastAsia="Calibri" w:hAnsi="Calibri"/>
+          <w:b w:val="false"/>
+          <w:bCs w:val="false"/>
+          <w:i w:val="false"/>
+          <w:iCs w:val="false"/>
+          <w:color w:val="1A1A1A"/>
+          <w:sz w:val="22"/>
+          <w:szCs w:val="22"/>
+        </w:rPr>
+        <w:t xml:space="preserve">Extract the download: tar -xzf APRSCommand-vX.X.X-linux-x64.tar.gz</w:t>
+      </w:r>
+    </w:p>
+    <w:p>
+      <w:pPr>
+        <w:spacing w:after="60" w:before="60"/>
+        <w:ind w:left="720" w:hanging="360"/>
+      </w:pPr>
+      <w:r>
+        <w:rPr>
+          <w:rFonts w:ascii="Calibri" w:cs="Calibri" w:eastAsia="Calibri" w:hAnsi="Calibri"/>
+          <w:b/>
+          <w:bCs/>
+          <w:i w:val="false"/>
+          <w:iCs w:val="false"/>
+          <w:color w:val="1A56A0"/>
+          <w:sz w:val="22"/>
+          <w:szCs w:val="22"/>
+        </w:rPr>
+        <w:t xml:space="preserve">2.  </w:t>
+      </w:r>
+      <w:r>
+        <w:rPr>
+          <w:rFonts w:ascii="Calibri" w:cs="Calibri" w:eastAsia="Calibri" w:hAnsi="Calibri"/>
+          <w:b w:val="false"/>
+          <w:bCs w:val="false"/>
+          <w:i w:val="false"/>
+          <w:iCs w:val="false"/>
+          <w:color w:val="1A1A1A"/>
+          <w:sz w:val="22"/>
+          <w:szCs w:val="22"/>
+        </w:rPr>
+        <w:t xml:space="preserve">Enter the extracted folder: cd APRS-Command-linux-x64</w:t>
       </w:r>
     </w:p>
     <w:p>
@@ -6619,7 +7149,26 @@
           <w:sz w:val="22"/>
           <w:szCs w:val="22"/>
         </w:rPr>
-        <w:t xml:space="preserve">Installation is identical to Linux, using the ARM64 download. Run these commands in a terminal on the Pi:</w:t>
+        <w:t xml:space="preserve">Installation follows the same installer-or-portable choice as Linux (Section 2.6), using the ARM64 build. The .deb installer is recommended — it registers APRS Command in your application menu automatically, which is convenient if you're running the Pi with a display attached. Run these commands in a terminal on the Pi:</w:t>
+      </w:r>
+    </w:p>
+    <w:p>
+      <w:pPr>
+        <w:keepNext/>
+        <w:spacing w:after="40" w:before="200"/>
+      </w:pPr>
+      <w:r>
+        <w:rPr>
+          <w:rFonts w:ascii="Calibri" w:cs="Calibri" w:eastAsia="Calibri" w:hAnsi="Calibri"/>
+          <w:b/>
+          <w:bCs/>
+          <w:i w:val="false"/>
+          <w:iCs w:val="false"/>
+          <w:color w:val="0F2A4A"/>
+          <w:sz w:val="22"/>
+          <w:szCs w:val="22"/>
+        </w:rPr>
+        <w:t xml:space="preserve">Installer Method (Recommended)</w:t>
       </w:r>
     </w:p>
     <w:p>
@@ -6651,7 +7200,7 @@
           <w:sz w:val="22"/>
           <w:szCs w:val="22"/>
         </w:rPr>
-        <w:t xml:space="preserve">Download the -linux-arm64.zip file from the releases page.</w:t>
+        <w:t xml:space="preserve">Download aprs-command_X.Y.Z_arm64.deb from the releases page.</w:t>
       </w:r>
     </w:p>
     <w:p>
@@ -6683,7 +7232,7 @@
           <w:sz w:val="22"/>
           <w:szCs w:val="22"/>
         </w:rPr>
-        <w:t xml:space="preserve">Unzip: unzip APRSCommand-vX.X.X-linux-arm64.zip</w:t>
+        <w:t xml:space="preserve">Install it: sudo dpkg -i aprs-command_X.Y.Z_arm64.deb</w:t>
       </w:r>
     </w:p>
     <w:p>
@@ -6715,7 +7264,122 @@
           <w:sz w:val="22"/>
           <w:szCs w:val="22"/>
         </w:rPr>
-        <w:t xml:space="preserve">Enter the folder: cd APRSCommand-vX.X.X-linux-arm64</w:t>
+        <w:t xml:space="preserve">Launch from a terminal (aprs-command) or from the application menu if running with a display attached.</w:t>
+      </w:r>
+    </w:p>
+    <w:p>
+      <w:pPr>
+        <w:keepNext/>
+        <w:spacing w:after="40" w:before="200"/>
+      </w:pPr>
+      <w:r>
+        <w:rPr>
+          <w:rFonts w:ascii="Calibri" w:cs="Calibri" w:eastAsia="Calibri" w:hAnsi="Calibri"/>
+          <w:b/>
+          <w:bCs/>
+          <w:i w:val="false"/>
+          <w:iCs w:val="false"/>
+          <w:color w:val="0F2A4A"/>
+          <w:sz w:val="22"/>
+          <w:szCs w:val="22"/>
+        </w:rPr>
+        <w:t xml:space="preserve">Portable Archive Method (Alternative)</w:t>
+      </w:r>
+    </w:p>
+    <w:p>
+      <w:pPr>
+        <w:spacing w:after="60" w:before="60"/>
+        <w:ind w:left="720" w:hanging="360"/>
+      </w:pPr>
+      <w:r>
+        <w:rPr>
+          <w:rFonts w:ascii="Calibri" w:cs="Calibri" w:eastAsia="Calibri" w:hAnsi="Calibri"/>
+          <w:b/>
+          <w:bCs/>
+          <w:i w:val="false"/>
+          <w:iCs w:val="false"/>
+          <w:color w:val="1A56A0"/>
+          <w:sz w:val="22"/>
+          <w:szCs w:val="22"/>
+        </w:rPr>
+        <w:t xml:space="preserve">1.  </w:t>
+      </w:r>
+      <w:r>
+        <w:rPr>
+          <w:rFonts w:ascii="Calibri" w:cs="Calibri" w:eastAsia="Calibri" w:hAnsi="Calibri"/>
+          <w:b w:val="false"/>
+          <w:bCs w:val="false"/>
+          <w:i w:val="false"/>
+          <w:iCs w:val="false"/>
+          <w:color w:val="1A1A1A"/>
+          <w:sz w:val="22"/>
+          <w:szCs w:val="22"/>
+        </w:rPr>
+        <w:t xml:space="preserve">Download the -linux-arm64.tar.gz file from the releases page.</w:t>
+      </w:r>
+    </w:p>
+    <w:p>
+      <w:pPr>
+        <w:spacing w:after="60" w:before="60"/>
+        <w:ind w:left="720" w:hanging="360"/>
+      </w:pPr>
+      <w:r>
+        <w:rPr>
+          <w:rFonts w:ascii="Calibri" w:cs="Calibri" w:eastAsia="Calibri" w:hAnsi="Calibri"/>
+          <w:b/>
+          <w:bCs/>
+          <w:i w:val="false"/>
+          <w:iCs w:val="false"/>
+          <w:color w:val="1A56A0"/>
+          <w:sz w:val="22"/>
+          <w:szCs w:val="22"/>
+        </w:rPr>
+        <w:t xml:space="preserve">2.  </w:t>
+      </w:r>
+      <w:r>
+        <w:rPr>
+          <w:rFonts w:ascii="Calibri" w:cs="Calibri" w:eastAsia="Calibri" w:hAnsi="Calibri"/>
+          <w:b w:val="false"/>
+          <w:bCs w:val="false"/>
+          <w:i w:val="false"/>
+          <w:iCs w:val="false"/>
+          <w:color w:val="1A1A1A"/>
+          <w:sz w:val="22"/>
+          <w:szCs w:val="22"/>
+        </w:rPr>
+        <w:t xml:space="preserve">Extract: tar -xzf APRSCommand-vX.X.X-linux-arm64.tar.gz</w:t>
+      </w:r>
+    </w:p>
+    <w:p>
+      <w:pPr>
+        <w:spacing w:after="60" w:before="60"/>
+        <w:ind w:left="720" w:hanging="360"/>
+      </w:pPr>
+      <w:r>
+        <w:rPr>
+          <w:rFonts w:ascii="Calibri" w:cs="Calibri" w:eastAsia="Calibri" w:hAnsi="Calibri"/>
+          <w:b/>
+          <w:bCs/>
+          <w:i w:val="false"/>
+          <w:iCs w:val="false"/>
+          <w:color w:val="1A56A0"/>
+          <w:sz w:val="22"/>
+          <w:szCs w:val="22"/>
+        </w:rPr>
+        <w:t xml:space="preserve">3.  </w:t>
+      </w:r>
+      <w:r>
+        <w:rPr>
+          <w:rFonts w:ascii="Calibri" w:cs="Calibri" w:eastAsia="Calibri" w:hAnsi="Calibri"/>
+          <w:b w:val="false"/>
+          <w:bCs w:val="false"/>
+          <w:i w:val="false"/>
+          <w:iCs w:val="false"/>
+          <w:color w:val="1A1A1A"/>
+          <w:sz w:val="22"/>
+          <w:szCs w:val="22"/>
+        </w:rPr>
+        <w:t xml:space="preserve">Enter the folder: cd APRS-Command-linux-arm64</w:t>
       </w:r>
     </w:p>
     <w:p>

</xml_diff>